<commit_message>
Cambios sin importancia Guion Claudia
</commit_message>
<xml_diff>
--- a/Guiones/Guion_exposición-Claudia-.docx
+++ b/Guiones/Guion_exposición-Claudia-.docx
@@ -1,6 +1,6 @@
 
 <file path=word/document.xml><?xml version="1.0" encoding="utf-8"?>
-<w:document xmlns:wpc="http://schemas.microsoft.com/office/word/2010/wordprocessingCanvas" xmlns:cx="http://schemas.microsoft.com/office/drawing/2014/chartex" xmlns:cx1="http://schemas.microsoft.com/office/drawing/2015/9/8/chartex" xmlns:cx2="http://schemas.microsoft.com/office/drawing/2015/10/21/chartex" xmlns:cx3="http://schemas.microsoft.com/office/drawing/2016/5/9/chartex" xmlns:cx4="http://schemas.microsoft.com/office/drawing/2016/5/10/chartex" xmlns:cx5="http://schemas.microsoft.com/office/drawing/2016/5/11/chartex" xmlns:cx6="http://schemas.microsoft.com/office/drawing/2016/5/12/chartex" xmlns:cx7="http://schemas.microsoft.com/office/drawing/2016/5/13/chartex" xmlns:cx8="http://schemas.microsoft.com/office/drawing/2016/5/14/chartex" xmlns:mc="http://schemas.openxmlformats.org/markup-compatibility/2006" xmlns:aink="http://schemas.microsoft.com/office/drawing/2016/ink" xmlns:am3d="http://schemas.microsoft.com/office/drawing/2017/model3d" xmlns:o="urn:schemas-microsoft-com:office:office" xmlns:oel="http://schemas.microsoft.com/office/2019/extlst" xmlns:r="http://schemas.openxmlformats.org/officeDocument/2006/relationships" xmlns:m="http://schemas.openxmlformats.org/officeDocument/2006/math" xmlns:v="urn:schemas-microsoft-com:vml" xmlns:wp14="http://schemas.microsoft.com/office/word/2010/wordprocessingDrawing" xmlns:wp="http://schemas.openxmlformats.org/drawingml/2006/wordprocessingDrawing" xmlns:w10="urn:schemas-microsoft-com:office:word" xmlns:w="http://schemas.openxmlformats.org/wordprocessingml/2006/main" xmlns:w14="http://schemas.microsoft.com/office/word/2010/wordml" xmlns:w15="http://schemas.microsoft.com/office/word/2012/wordml" xmlns:w16cex="http://schemas.microsoft.com/office/word/2018/wordml/cex" xmlns:w16cid="http://schemas.microsoft.com/office/word/2016/wordml/cid" xmlns:w16="http://schemas.microsoft.com/office/word/2018/wordml" xmlns:w16du="http://schemas.microsoft.com/office/word/2023/wordml/word16du" xmlns:w16sdtdh="http://schemas.microsoft.com/office/word/2020/wordml/sdtdatahash" xmlns:w16sdtfl="http://schemas.microsoft.com/office/word/2024/wordml/sdtformatlock" xmlns:w16se="http://schemas.microsoft.com/office/word/2015/wordml/symex" xmlns:wpg="http://schemas.microsoft.com/office/word/2010/wordprocessingGroup" xmlns:wpi="http://schemas.microsoft.com/office/word/2010/wordprocessingInk" xmlns:wne="http://schemas.microsoft.com/office/word/2006/wordml" xmlns:wps="http://schemas.microsoft.com/office/word/2010/wordprocessingShape" mc:Ignorable="w14 w15 w16se w16cid w16 w16cex w16sdtdh w16sdtfl w16du wp14">
+<w:document xmlns:wpc="http://schemas.microsoft.com/office/word/2010/wordprocessingCanvas" xmlns:cx="http://schemas.microsoft.com/office/drawing/2014/chartex" xmlns:cx1="http://schemas.microsoft.com/office/drawing/2015/9/8/chartex" xmlns:cx2="http://schemas.microsoft.com/office/drawing/2015/10/21/chartex" xmlns:cx3="http://schemas.microsoft.com/office/drawing/2016/5/9/chartex" xmlns:cx4="http://schemas.microsoft.com/office/drawing/2016/5/10/chartex" xmlns:cx5="http://schemas.microsoft.com/office/drawing/2016/5/11/chartex" xmlns:cx6="http://schemas.microsoft.com/office/drawing/2016/5/12/chartex" xmlns:cx7="http://schemas.microsoft.com/office/drawing/2016/5/13/chartex" xmlns:cx8="http://schemas.microsoft.com/office/drawing/2016/5/14/chartex" xmlns:mc="http://schemas.openxmlformats.org/markup-compatibility/2006" xmlns:aink="http://schemas.microsoft.com/office/drawing/2016/ink" xmlns:am3d="http://schemas.microsoft.com/office/drawing/2017/model3d" xmlns:o="urn:schemas-microsoft-com:office:office" xmlns:oel="http://schemas.microsoft.com/office/2019/extlst" xmlns:r="http://schemas.openxmlformats.org/officeDocument/2006/relationships" xmlns:m="http://schemas.openxmlformats.org/officeDocument/2006/math" xmlns:v="urn:schemas-microsoft-com:vml" xmlns:wp14="http://schemas.microsoft.com/office/word/2010/wordprocessingDrawing" xmlns:wp="http://schemas.openxmlformats.org/drawingml/2006/wordprocessingDrawing" xmlns:w10="urn:schemas-microsoft-com:office:word" xmlns:w="http://schemas.openxmlformats.org/wordprocessingml/2006/main" xmlns:w14="http://schemas.microsoft.com/office/word/2010/wordml" xmlns:w15="http://schemas.microsoft.com/office/word/2012/wordml" xmlns:w16cex="http://schemas.microsoft.com/office/word/2018/wordml/cex" xmlns:w16cid="http://schemas.microsoft.com/office/word/2016/wordml/cid" xmlns:w16="http://schemas.microsoft.com/office/word/2018/wordml" xmlns:w16du="http://schemas.microsoft.com/office/word/2023/wordml/word16du" xmlns:w16sdtdh="http://schemas.microsoft.com/office/word/2020/wordml/sdtdatahash" xmlns:w16se="http://schemas.microsoft.com/office/word/2015/wordml/symex" xmlns:wpg="http://schemas.microsoft.com/office/word/2010/wordprocessingGroup" xmlns:wpi="http://schemas.microsoft.com/office/word/2010/wordprocessingInk" xmlns:wne="http://schemas.microsoft.com/office/word/2006/wordml" xmlns:wps="http://schemas.microsoft.com/office/word/2010/wordprocessingShape" mc:Ignorable="w14 w15 w16se w16cid w16 w16cex w16sdtdh w16du wp14">
   <w:body>
     <w:p>
       <w:pPr>
@@ -23,6 +23,11 @@
     </w:p>
     <w:p>
       <w:pPr>
+        <w:pStyle w:val="Prrafodelista"/>
+        <w:numPr>
+          <w:ilvl w:val="0"/>
+          <w:numId w:val="3"/>
+        </w:numPr>
         <w:jc w:val="both"/>
         <w:rPr>
           <w:rFonts w:ascii="Calibri" w:hAnsi="Calibri" w:cs="Calibri"/>
@@ -36,19 +41,16 @@
           <w:sz w:val="22"/>
           <w:szCs w:val="22"/>
         </w:rPr>
-        <w:t xml:space="preserve">Los modelos de progresión del cáncer pretenden describir y reproducir el desarrollo evolutivo de un tejido sano hacia un tumor maligno impulsado por </w:t>
-      </w:r>
-      <w:r>
-        <w:rPr>
-          <w:rFonts w:ascii="Calibri" w:hAnsi="Calibri" w:cs="Calibri"/>
-          <w:sz w:val="22"/>
-          <w:szCs w:val="22"/>
-        </w:rPr>
-        <w:t>la acumulación de mutaciones.</w:t>
+        <w:t>Los modelos de progresión del cáncer pretenden describir y reproducir el desarrollo evolutivo de un tejido sano hacia un tumor maligno impulsado por la acumulación de mutaciones.</w:t>
       </w:r>
     </w:p>
     <w:p>
       <w:pPr>
+        <w:pStyle w:val="Prrafodelista"/>
+        <w:numPr>
+          <w:ilvl w:val="0"/>
+          <w:numId w:val="3"/>
+        </w:numPr>
         <w:jc w:val="both"/>
         <w:rPr>
           <w:rFonts w:ascii="Calibri" w:hAnsi="Calibri" w:cs="Calibri"/>
@@ -80,115 +82,16 @@
           <w:sz w:val="22"/>
           <w:szCs w:val="22"/>
         </w:rPr>
-        <w:t xml:space="preserve"> (MHN), los cuales se basan en algoritmos de aprendizaje automático para modelar la tasa de aparición de eventos, como las mutaciones. Estos modelos incorporan una tasa espontánea de adquisición, junto con un efecto multiplicativo que cada mutación puede ejercer sobre la tasa de otras, a través de interacciones por pares que reflejan tanto dependencias promotoras como inhibidoras. Este enfoque constituye un tipo de modelo </w:t>
-      </w:r>
-      <w:r>
-        <w:rPr>
-          <w:rFonts w:ascii="Calibri" w:hAnsi="Calibri" w:cs="Calibri"/>
-          <w:sz w:val="22"/>
-          <w:szCs w:val="22"/>
-        </w:rPr>
-        <w:t xml:space="preserve">no </w:t>
-      </w:r>
-      <w:r>
-        <w:rPr>
-          <w:rFonts w:ascii="Calibri" w:hAnsi="Calibri" w:cs="Calibri"/>
-          <w:sz w:val="22"/>
-          <w:szCs w:val="22"/>
-        </w:rPr>
-        <w:t>determinístico</w:t>
-      </w:r>
-      <w:commentRangeStart w:id="0"/>
-      <w:r>
-        <w:rPr>
-          <w:rFonts w:ascii="Calibri" w:hAnsi="Calibri" w:cs="Calibri"/>
-          <w:sz w:val="22"/>
-          <w:szCs w:val="22"/>
-        </w:rPr>
-        <w:t>, ya que las mutaciones pueden tener efectos tanto potenciadores como inhibidores sobre la adquisición de nuevas mutaciones.</w:t>
-      </w:r>
-      <w:r>
-        <w:rPr>
-          <w:rFonts w:ascii="Calibri" w:hAnsi="Calibri" w:cs="Calibri"/>
-          <w:sz w:val="22"/>
-          <w:szCs w:val="22"/>
-        </w:rPr>
-        <w:t xml:space="preserve"> </w:t>
-      </w:r>
-      <w:commentRangeEnd w:id="0"/>
-      <w:r>
-        <w:rPr>
-          <w:rStyle w:val="Refdecomentario"/>
-        </w:rPr>
-        <w:commentReference w:id="0"/>
-      </w:r>
-      <w:r>
-        <w:rPr>
-          <w:rFonts w:ascii="Calibri" w:hAnsi="Calibri" w:cs="Calibri"/>
-          <w:sz w:val="22"/>
-          <w:szCs w:val="22"/>
-        </w:rPr>
-        <w:t>Este modelo cuenta con una serie de supuestos: se sufre una acumulación de eventos irreversible, las muestras son independientes</w:t>
-      </w:r>
-      <w:r>
-        <w:rPr>
-          <w:rFonts w:ascii="Calibri" w:hAnsi="Calibri" w:cs="Calibri"/>
-          <w:sz w:val="22"/>
-          <w:szCs w:val="22"/>
-        </w:rPr>
-        <w:t xml:space="preserve">, </w:t>
-      </w:r>
-      <w:r>
-        <w:rPr>
-          <w:rFonts w:ascii="Calibri" w:hAnsi="Calibri" w:cs="Calibri"/>
-          <w:sz w:val="22"/>
-          <w:szCs w:val="22"/>
-        </w:rPr>
-        <w:t>datos son homogéneos</w:t>
-      </w:r>
-      <w:r>
-        <w:rPr>
-          <w:rFonts w:ascii="Calibri" w:hAnsi="Calibri" w:cs="Calibri"/>
-          <w:sz w:val="22"/>
-          <w:szCs w:val="22"/>
-        </w:rPr>
-        <w:t xml:space="preserve"> y </w:t>
-      </w:r>
-      <w:r>
-        <w:rPr>
-          <w:rFonts w:ascii="Calibri" w:hAnsi="Calibri" w:cs="Calibri"/>
-          <w:sz w:val="22"/>
-          <w:szCs w:val="22"/>
-        </w:rPr>
-        <w:t xml:space="preserve">el momento en que se produce </w:t>
-      </w:r>
-      <w:r>
-        <w:rPr>
-          <w:rFonts w:ascii="Calibri" w:hAnsi="Calibri" w:cs="Calibri"/>
-          <w:sz w:val="22"/>
-          <w:szCs w:val="22"/>
-        </w:rPr>
-        <w:t xml:space="preserve">la </w:t>
-      </w:r>
-      <w:r>
-        <w:rPr>
-          <w:rFonts w:ascii="Calibri" w:hAnsi="Calibri" w:cs="Calibri"/>
-          <w:sz w:val="22"/>
-          <w:szCs w:val="22"/>
-        </w:rPr>
-        <w:t>observación</w:t>
-      </w:r>
-      <w:r>
-        <w:rPr>
-          <w:rFonts w:ascii="Calibri" w:hAnsi="Calibri" w:cs="Calibri"/>
-          <w:sz w:val="22"/>
-          <w:szCs w:val="22"/>
-        </w:rPr>
-        <w:t xml:space="preserve"> del tumor es independiente de los acontecimientos precedentes.</w:t>
+        <w:t xml:space="preserve"> (MHN), los cuales se basan en algoritmos de aprendizaje automático para modelar la tasa de aparición de eventos, como las mutaciones.</w:t>
       </w:r>
     </w:p>
     <w:p>
       <w:pPr>
+        <w:pStyle w:val="Prrafodelista"/>
+        <w:numPr>
+          <w:ilvl w:val="0"/>
+          <w:numId w:val="3"/>
+        </w:numPr>
         <w:jc w:val="both"/>
         <w:rPr>
           <w:rFonts w:ascii="Calibri" w:hAnsi="Calibri" w:cs="Calibri"/>
@@ -202,68 +105,151 @@
           <w:sz w:val="22"/>
           <w:szCs w:val="22"/>
         </w:rPr>
-        <w:t xml:space="preserve">Dado que, por definición, un conjunto de datos solo incluye tumores </w:t>
-      </w:r>
-      <w:r>
-        <w:rPr>
-          <w:rFonts w:ascii="Calibri" w:hAnsi="Calibri" w:cs="Calibri"/>
-          <w:sz w:val="22"/>
-          <w:szCs w:val="22"/>
-        </w:rPr>
-        <w:t xml:space="preserve">una vez han sido observados estamos condicionando los datos por la variable observación del tumor, lo que puede dar lugar </w:t>
-      </w:r>
-      <w:r>
-        <w:rPr>
-          <w:rFonts w:ascii="Calibri" w:hAnsi="Calibri" w:cs="Calibri"/>
-          <w:sz w:val="22"/>
-          <w:szCs w:val="22"/>
-        </w:rPr>
-        <w:t xml:space="preserve">al conocido sesgo del «condicionamiento por </w:t>
-      </w:r>
-      <w:proofErr w:type="spellStart"/>
-      <w:r>
-        <w:rPr>
-          <w:rFonts w:ascii="Calibri" w:hAnsi="Calibri" w:cs="Calibri"/>
-          <w:sz w:val="22"/>
-          <w:szCs w:val="22"/>
-        </w:rPr>
-        <w:t>collider</w:t>
-      </w:r>
-      <w:proofErr w:type="spellEnd"/>
-      <w:r>
-        <w:rPr>
-          <w:rFonts w:ascii="Calibri" w:hAnsi="Calibri" w:cs="Calibri"/>
-          <w:sz w:val="22"/>
-          <w:szCs w:val="22"/>
-        </w:rPr>
-        <w:t xml:space="preserve">» o la paradoja de </w:t>
-      </w:r>
-      <w:proofErr w:type="spellStart"/>
-      <w:r>
-        <w:rPr>
-          <w:rFonts w:ascii="Calibri" w:hAnsi="Calibri" w:cs="Calibri"/>
-          <w:sz w:val="22"/>
-          <w:szCs w:val="22"/>
-        </w:rPr>
-        <w:t>Berkson</w:t>
-      </w:r>
-      <w:proofErr w:type="spellEnd"/>
-      <w:r>
-        <w:rPr>
-          <w:rFonts w:ascii="Calibri" w:hAnsi="Calibri" w:cs="Calibri"/>
-          <w:sz w:val="22"/>
-          <w:szCs w:val="22"/>
-        </w:rPr>
-        <w:t xml:space="preserve">. En este contexto, la variable "observación del tumor" actúa como un </w:t>
-      </w:r>
-      <w:proofErr w:type="spellStart"/>
-      <w:r>
-        <w:rPr>
-          <w:rFonts w:ascii="Calibri" w:hAnsi="Calibri" w:cs="Calibri"/>
-          <w:sz w:val="22"/>
-          <w:szCs w:val="22"/>
-        </w:rPr>
-        <w:t>col</w:t>
+        <w:t xml:space="preserve">Estos modelos incorporan una tasa espontánea de adquisición, junto con un efecto multiplicativo que cada mutación puede ejercer sobre la tasa de otras, a través de interacciones por pares que reflejan tanto dependencias promotoras como inhibidoras. Este enfoque constituye un tipo de modelo </w:t>
+      </w:r>
+      <w:r>
+        <w:rPr>
+          <w:rFonts w:ascii="Calibri" w:hAnsi="Calibri" w:cs="Calibri"/>
+          <w:sz w:val="22"/>
+          <w:szCs w:val="22"/>
+        </w:rPr>
+        <w:t xml:space="preserve">no </w:t>
+      </w:r>
+      <w:r>
+        <w:rPr>
+          <w:rFonts w:ascii="Calibri" w:hAnsi="Calibri" w:cs="Calibri"/>
+          <w:sz w:val="22"/>
+          <w:szCs w:val="22"/>
+        </w:rPr>
+        <w:t>determinístico.</w:t>
+      </w:r>
+    </w:p>
+    <w:p>
+      <w:pPr>
+        <w:pStyle w:val="Prrafodelista"/>
+        <w:numPr>
+          <w:ilvl w:val="0"/>
+          <w:numId w:val="3"/>
+        </w:numPr>
+        <w:jc w:val="both"/>
+        <w:rPr>
+          <w:rFonts w:ascii="Calibri" w:hAnsi="Calibri" w:cs="Calibri"/>
+          <w:sz w:val="22"/>
+          <w:szCs w:val="22"/>
+        </w:rPr>
+      </w:pPr>
+      <w:r>
+        <w:rPr>
+          <w:rFonts w:ascii="Calibri" w:hAnsi="Calibri" w:cs="Calibri"/>
+          <w:sz w:val="22"/>
+          <w:szCs w:val="22"/>
+        </w:rPr>
+        <w:t xml:space="preserve">Este modelo cuenta con una serie de supuestos: se sufre una acumulación de eventos irreversible, </w:t>
+      </w:r>
+      <w:r>
+        <w:rPr>
+          <w:rFonts w:ascii="Calibri" w:hAnsi="Calibri" w:cs="Calibri"/>
+          <w:sz w:val="22"/>
+          <w:szCs w:val="22"/>
+        </w:rPr>
+        <w:t xml:space="preserve">las mutaciones aparecen de una en una, </w:t>
+      </w:r>
+      <w:r>
+        <w:rPr>
+          <w:rFonts w:ascii="Calibri" w:hAnsi="Calibri" w:cs="Calibri"/>
+          <w:sz w:val="22"/>
+          <w:szCs w:val="22"/>
+        </w:rPr>
+        <w:t>las muestras son independientes</w:t>
+      </w:r>
+      <w:r>
+        <w:rPr>
+          <w:rFonts w:ascii="Calibri" w:hAnsi="Calibri" w:cs="Calibri"/>
+          <w:sz w:val="22"/>
+          <w:szCs w:val="22"/>
+        </w:rPr>
+        <w:t xml:space="preserve">, </w:t>
+      </w:r>
+      <w:r>
+        <w:rPr>
+          <w:rFonts w:ascii="Calibri" w:hAnsi="Calibri" w:cs="Calibri"/>
+          <w:sz w:val="22"/>
+          <w:szCs w:val="22"/>
+        </w:rPr>
+        <w:t>datos son homogéneos</w:t>
+      </w:r>
+      <w:r>
+        <w:rPr>
+          <w:rFonts w:ascii="Calibri" w:hAnsi="Calibri" w:cs="Calibri"/>
+          <w:sz w:val="22"/>
+          <w:szCs w:val="22"/>
+        </w:rPr>
+        <w:t xml:space="preserve"> y el momento en que se produce la observación del tumor es independiente de los acontecimientos precedentes.</w:t>
+      </w:r>
+    </w:p>
+    <w:p>
+      <w:pPr>
+        <w:pStyle w:val="Prrafodelista"/>
+        <w:jc w:val="both"/>
+        <w:rPr>
+          <w:rFonts w:ascii="Calibri" w:hAnsi="Calibri" w:cs="Calibri"/>
+          <w:sz w:val="22"/>
+          <w:szCs w:val="22"/>
+        </w:rPr>
+      </w:pPr>
+    </w:p>
+    <w:p>
+      <w:pPr>
+        <w:pStyle w:val="Prrafodelista"/>
+        <w:numPr>
+          <w:ilvl w:val="0"/>
+          <w:numId w:val="3"/>
+        </w:numPr>
+        <w:jc w:val="both"/>
+        <w:rPr>
+          <w:rFonts w:ascii="Calibri" w:hAnsi="Calibri" w:cs="Calibri"/>
+          <w:sz w:val="22"/>
+          <w:szCs w:val="22"/>
+        </w:rPr>
+      </w:pPr>
+      <w:r>
+        <w:rPr>
+          <w:rFonts w:ascii="Calibri" w:hAnsi="Calibri" w:cs="Calibri"/>
+          <w:sz w:val="22"/>
+          <w:szCs w:val="22"/>
+        </w:rPr>
+        <w:t xml:space="preserve">Dado que, por definición, un conjunto de datos solo incluye tumores una vez han sido observados estamos condicionando los datos por la variable observación del tumor, lo que puede dar lugar </w:t>
+      </w:r>
+      <w:r>
+        <w:rPr>
+          <w:rFonts w:ascii="Calibri" w:hAnsi="Calibri" w:cs="Calibri"/>
+          <w:sz w:val="22"/>
+          <w:szCs w:val="22"/>
+        </w:rPr>
+        <w:t xml:space="preserve">al conocido sesgo del «condicionamiento por collider» o la paradoja de Berkson. </w:t>
+      </w:r>
+    </w:p>
+    <w:p>
+      <w:pPr>
+        <w:pStyle w:val="Prrafodelista"/>
+        <w:numPr>
+          <w:ilvl w:val="0"/>
+          <w:numId w:val="3"/>
+        </w:numPr>
+        <w:jc w:val="both"/>
+        <w:rPr>
+          <w:rFonts w:ascii="Calibri" w:hAnsi="Calibri" w:cs="Calibri"/>
+          <w:sz w:val="22"/>
+          <w:szCs w:val="22"/>
+        </w:rPr>
+      </w:pPr>
+      <w:r>
+        <w:rPr>
+          <w:rFonts w:ascii="Calibri" w:hAnsi="Calibri" w:cs="Calibri"/>
+          <w:sz w:val="22"/>
+          <w:szCs w:val="22"/>
+        </w:rPr>
+        <w:t>En este contexto, la variable "observación del tumor" actúa como un col</w:t>
       </w:r>
       <w:r>
         <w:rPr>
@@ -273,14 +259,36 @@
         </w:rPr>
         <w:t>lider</w:t>
       </w:r>
-      <w:proofErr w:type="spellEnd"/>
-      <w:r>
-        <w:rPr>
-          <w:rFonts w:ascii="Calibri" w:hAnsi="Calibri" w:cs="Calibri"/>
-          <w:sz w:val="22"/>
-          <w:szCs w:val="22"/>
-        </w:rPr>
-        <w:t xml:space="preserve">, ya que se ve influenciada por dos factores: las mutaciones genéticas y las circunstancias externas que favorecen la detección del tumor. Por ejemplo, una acumulación más agresiva de mutaciones que promueven el crecimiento del tumor también facilitará su observación. Para abordar este problema, los </w:t>
+      <w:r>
+        <w:rPr>
+          <w:rFonts w:ascii="Calibri" w:hAnsi="Calibri" w:cs="Calibri"/>
+          <w:sz w:val="22"/>
+          <w:szCs w:val="22"/>
+        </w:rPr>
+        <w:t xml:space="preserve">, ya que se ve influenciada por dos factores: las mutaciones genéticas y las circunstancias externas que favorecen la detección del tumor. Por ejemplo, una acumulación más agresiva de mutaciones que promueven el crecimiento del tumor también facilitará su observación. </w:t>
+      </w:r>
+    </w:p>
+    <w:p>
+      <w:pPr>
+        <w:pStyle w:val="Prrafodelista"/>
+        <w:numPr>
+          <w:ilvl w:val="0"/>
+          <w:numId w:val="3"/>
+        </w:numPr>
+        <w:jc w:val="both"/>
+        <w:rPr>
+          <w:rFonts w:ascii="Calibri" w:hAnsi="Calibri" w:cs="Calibri"/>
+          <w:sz w:val="22"/>
+          <w:szCs w:val="22"/>
+        </w:rPr>
+      </w:pPr>
+      <w:r>
+        <w:rPr>
+          <w:rFonts w:ascii="Calibri" w:hAnsi="Calibri" w:cs="Calibri"/>
+          <w:sz w:val="22"/>
+          <w:szCs w:val="22"/>
+        </w:rPr>
+        <w:t xml:space="preserve">Para abordar este problema, los </w:t>
       </w:r>
       <w:r>
         <w:rPr>
@@ -303,6 +311,7 @@
     </w:p>
     <w:p>
       <w:pPr>
+        <w:pStyle w:val="Prrafodelista"/>
         <w:jc w:val="both"/>
         <w:rPr>
           <w:rFonts w:ascii="Calibri" w:hAnsi="Calibri" w:cs="Calibri"/>
@@ -310,223 +319,14 @@
           <w:szCs w:val="22"/>
         </w:rPr>
       </w:pPr>
-      <w:r>
-        <w:rPr>
-          <w:rFonts w:ascii="Calibri" w:hAnsi="Calibri" w:cs="Calibri"/>
-          <w:sz w:val="22"/>
-          <w:szCs w:val="22"/>
-        </w:rPr>
-        <w:t xml:space="preserve">Respecto al modelo clásico (sin la corrección), </w:t>
-      </w:r>
-      <w:r>
-        <w:rPr>
-          <w:rFonts w:ascii="Calibri" w:hAnsi="Calibri" w:cs="Calibri"/>
-          <w:sz w:val="22"/>
-          <w:szCs w:val="22"/>
-        </w:rPr>
-        <w:t xml:space="preserve">las tasas de transición entre estados son </w:t>
-      </w:r>
-      <w:r>
-        <w:rPr>
-          <w:rFonts w:ascii="Calibri" w:hAnsi="Calibri" w:cs="Calibri"/>
-          <w:sz w:val="22"/>
-          <w:szCs w:val="22"/>
-        </w:rPr>
-        <w:t>modeladas en una matriz Q</w:t>
-      </w:r>
-      <w:r>
-        <w:rPr>
-          <w:rFonts w:ascii="Calibri" w:hAnsi="Calibri" w:cs="Calibri"/>
-          <w:sz w:val="22"/>
-          <w:szCs w:val="22"/>
-        </w:rPr>
-        <w:t xml:space="preserve"> que se construye </w:t>
-      </w:r>
-      <w:r>
-        <w:rPr>
-          <w:rFonts w:ascii="Calibri" w:hAnsi="Calibri" w:cs="Calibri"/>
-          <w:sz w:val="22"/>
-          <w:szCs w:val="22"/>
-        </w:rPr>
-        <w:t xml:space="preserve">utilizando los parámetros </w:t>
-      </w:r>
-      <w:r>
-        <w:rPr>
-          <w:rFonts w:ascii="Calibri" w:hAnsi="Calibri" w:cs="Calibri" w:hint="eastAsia"/>
-          <w:sz w:val="22"/>
-          <w:szCs w:val="22"/>
-        </w:rPr>
-        <w:t>Θ</w:t>
-      </w:r>
-      <w:r>
-        <w:rPr>
-          <w:rFonts w:ascii="Calibri" w:hAnsi="Calibri" w:cs="Calibri"/>
-          <w:sz w:val="22"/>
-          <w:szCs w:val="22"/>
-        </w:rPr>
-        <w:t xml:space="preserve"> </w:t>
-      </w:r>
-      <w:r>
-        <w:rPr>
-          <w:rFonts w:ascii="Calibri" w:hAnsi="Calibri" w:cs="Calibri"/>
-          <w:sz w:val="22"/>
-          <w:szCs w:val="22"/>
-        </w:rPr>
-        <w:t xml:space="preserve">que representan las </w:t>
-      </w:r>
-      <w:commentRangeStart w:id="1"/>
-      <w:r>
-        <w:rPr>
-          <w:rFonts w:ascii="Calibri" w:hAnsi="Calibri" w:cs="Calibri"/>
-          <w:sz w:val="22"/>
-          <w:szCs w:val="22"/>
-        </w:rPr>
-        <w:t xml:space="preserve">tasas base </w:t>
-      </w:r>
-      <w:r>
-        <w:rPr>
-          <w:rFonts w:ascii="Calibri" w:hAnsi="Calibri" w:cs="Calibri" w:hint="eastAsia"/>
-          <w:sz w:val="22"/>
-          <w:szCs w:val="22"/>
-        </w:rPr>
-        <w:t>Θ</w:t>
-      </w:r>
-      <w:proofErr w:type="spellStart"/>
-      <w:r>
-        <w:rPr>
-          <w:rFonts w:ascii="Calibri" w:hAnsi="Calibri" w:cs="Calibri"/>
-          <w:sz w:val="22"/>
-          <w:szCs w:val="22"/>
-        </w:rPr>
-        <w:t>ii</w:t>
-      </w:r>
-      <w:proofErr w:type="spellEnd"/>
-      <w:r>
-        <w:rPr>
-          <w:rFonts w:ascii="Calibri" w:hAnsi="Calibri" w:cs="Calibri"/>
-          <w:sz w:val="22"/>
-          <w:szCs w:val="22"/>
-        </w:rPr>
-        <w:t xml:space="preserve"> y las interacciones entre eventos </w:t>
-      </w:r>
-      <w:r>
-        <w:rPr>
-          <w:rFonts w:ascii="Calibri" w:hAnsi="Calibri" w:cs="Calibri" w:hint="eastAsia"/>
-          <w:sz w:val="22"/>
-          <w:szCs w:val="22"/>
-        </w:rPr>
-        <w:t>Θ</w:t>
-      </w:r>
-      <w:proofErr w:type="spellStart"/>
-      <w:r>
-        <w:rPr>
-          <w:rFonts w:ascii="Calibri" w:hAnsi="Calibri" w:cs="Calibri"/>
-          <w:sz w:val="22"/>
-          <w:szCs w:val="22"/>
-        </w:rPr>
-        <w:t>ij</w:t>
-      </w:r>
-      <w:commentRangeEnd w:id="1"/>
-      <w:proofErr w:type="spellEnd"/>
-      <w:r>
-        <w:rPr>
-          <w:rStyle w:val="Refdecomentario"/>
-        </w:rPr>
-        <w:commentReference w:id="1"/>
-      </w:r>
-      <w:r>
-        <w:rPr>
-          <w:rFonts w:ascii="Calibri" w:hAnsi="Calibri" w:cs="Calibri"/>
-          <w:sz w:val="22"/>
-          <w:szCs w:val="22"/>
-        </w:rPr>
-        <w:t xml:space="preserve">. La matriz </w:t>
-      </w:r>
-      <w:r>
-        <w:rPr>
-          <w:rFonts w:ascii="Calibri" w:hAnsi="Calibri" w:cs="Calibri" w:hint="eastAsia"/>
-          <w:sz w:val="22"/>
-          <w:szCs w:val="22"/>
-        </w:rPr>
-        <w:t>Θ</w:t>
-      </w:r>
-      <w:r>
-        <w:rPr>
-          <w:rFonts w:ascii="Calibri" w:hAnsi="Calibri" w:cs="Calibri"/>
-          <w:sz w:val="22"/>
-          <w:szCs w:val="22"/>
-        </w:rPr>
-        <w:t xml:space="preserve"> </w:t>
-      </w:r>
-      <w:r>
-        <w:rPr>
-          <w:rFonts w:ascii="Calibri" w:hAnsi="Calibri" w:cs="Calibri"/>
-          <w:sz w:val="22"/>
-          <w:szCs w:val="22"/>
-        </w:rPr>
-        <w:t>captura la relación de interdependencia entre nodos</w:t>
-      </w:r>
-      <w:r>
-        <w:rPr>
-          <w:rFonts w:ascii="Calibri" w:hAnsi="Calibri" w:cs="Calibri"/>
-          <w:sz w:val="22"/>
-          <w:szCs w:val="22"/>
-        </w:rPr>
-        <w:t xml:space="preserve">. </w:t>
-      </w:r>
-      <w:r>
-        <w:rPr>
-          <w:rFonts w:ascii="Calibri" w:hAnsi="Calibri" w:cs="Calibri"/>
-          <w:sz w:val="22"/>
-          <w:szCs w:val="22"/>
-        </w:rPr>
-        <w:t xml:space="preserve">Cada elemento </w:t>
-      </w:r>
-      <w:r>
-        <w:rPr>
-          <w:rFonts w:ascii="Calibri" w:hAnsi="Calibri" w:cs="Calibri" w:hint="eastAsia"/>
-          <w:sz w:val="22"/>
-          <w:szCs w:val="22"/>
-        </w:rPr>
-        <w:t>Θ</w:t>
-      </w:r>
-      <w:proofErr w:type="spellStart"/>
-      <w:r>
-        <w:rPr>
-          <w:rFonts w:ascii="Calibri" w:hAnsi="Calibri" w:cs="Calibri"/>
-          <w:sz w:val="22"/>
-          <w:szCs w:val="22"/>
-        </w:rPr>
-        <w:t>ij</w:t>
-      </w:r>
-      <w:proofErr w:type="spellEnd"/>
-      <w:r>
-        <w:rPr>
-          <w:rFonts w:ascii="Calibri" w:hAnsi="Calibri" w:cs="Calibri"/>
-          <w:sz w:val="22"/>
-          <w:szCs w:val="22"/>
-        </w:rPr>
-        <w:t xml:space="preserve"> representa el impacto directo del evento j</w:t>
-      </w:r>
-      <w:r>
-        <w:rPr>
-          <w:rFonts w:ascii="Calibri" w:hAnsi="Calibri" w:cs="Calibri"/>
-          <w:sz w:val="22"/>
-          <w:szCs w:val="22"/>
-        </w:rPr>
-        <w:t xml:space="preserve"> </w:t>
-      </w:r>
-      <w:r>
-        <w:rPr>
-          <w:rFonts w:ascii="Calibri" w:hAnsi="Calibri" w:cs="Calibri"/>
-          <w:sz w:val="22"/>
-          <w:szCs w:val="22"/>
-        </w:rPr>
-        <w:t>sobre el evento i en términos del riesgo. La diagonal representa los riesgos sin considerar interdependencias.</w:t>
-      </w:r>
     </w:p>
     <w:p>
       <w:pPr>
+        <w:pStyle w:val="Prrafodelista"/>
+        <w:numPr>
+          <w:ilvl w:val="0"/>
+          <w:numId w:val="3"/>
+        </w:numPr>
         <w:jc w:val="both"/>
         <w:rPr>
           <w:rFonts w:ascii="Calibri" w:hAnsi="Calibri" w:cs="Calibri"/>
@@ -540,25 +340,65 @@
           <w:sz w:val="22"/>
           <w:szCs w:val="22"/>
         </w:rPr>
-        <w:t xml:space="preserve">El nuevo modelo </w:t>
-      </w:r>
-      <w:proofErr w:type="spellStart"/>
-      <w:r>
-        <w:rPr>
-          <w:rFonts w:ascii="Calibri" w:hAnsi="Calibri" w:cs="Calibri"/>
-          <w:sz w:val="22"/>
-          <w:szCs w:val="22"/>
-        </w:rPr>
-        <w:t>oMHN</w:t>
-      </w:r>
-      <w:proofErr w:type="spellEnd"/>
-      <w:r>
-        <w:rPr>
-          <w:rFonts w:ascii="Calibri" w:hAnsi="Calibri" w:cs="Calibri"/>
-          <w:sz w:val="22"/>
-          <w:szCs w:val="22"/>
-        </w:rPr>
-        <w:t xml:space="preserve"> incorpora explícitamente el evento de observación en la red causal como un evento adicional</w:t>
+        <w:t xml:space="preserve">Respecto al </w:t>
+      </w:r>
+      <w:r>
+        <w:rPr>
+          <w:rFonts w:ascii="Calibri" w:hAnsi="Calibri" w:cs="Calibri"/>
+          <w:b/>
+          <w:bCs/>
+          <w:sz w:val="22"/>
+          <w:szCs w:val="22"/>
+        </w:rPr>
+        <w:t>modelo clásico</w:t>
+      </w:r>
+      <w:r>
+        <w:rPr>
+          <w:rFonts w:ascii="Calibri" w:hAnsi="Calibri" w:cs="Calibri"/>
+          <w:sz w:val="22"/>
+          <w:szCs w:val="22"/>
+        </w:rPr>
+        <w:t xml:space="preserve"> (sin la corrección), </w:t>
+      </w:r>
+      <w:r>
+        <w:rPr>
+          <w:rFonts w:ascii="Calibri" w:hAnsi="Calibri" w:cs="Calibri"/>
+          <w:sz w:val="22"/>
+          <w:szCs w:val="22"/>
+        </w:rPr>
+        <w:t xml:space="preserve">las tasas de transición entre estados son </w:t>
+      </w:r>
+      <w:r>
+        <w:rPr>
+          <w:rFonts w:ascii="Calibri" w:hAnsi="Calibri" w:cs="Calibri"/>
+          <w:sz w:val="22"/>
+          <w:szCs w:val="22"/>
+        </w:rPr>
+        <w:t>modeladas en una matriz Q</w:t>
+      </w:r>
+      <w:r>
+        <w:rPr>
+          <w:rFonts w:ascii="Calibri" w:hAnsi="Calibri" w:cs="Calibri"/>
+          <w:sz w:val="22"/>
+          <w:szCs w:val="22"/>
+        </w:rPr>
+        <w:t xml:space="preserve"> que se construye </w:t>
+      </w:r>
+      <w:r>
+        <w:rPr>
+          <w:rFonts w:ascii="Calibri" w:hAnsi="Calibri" w:cs="Calibri"/>
+          <w:sz w:val="22"/>
+          <w:szCs w:val="22"/>
+        </w:rPr>
+        <w:t xml:space="preserve">utilizando los parámetros </w:t>
+      </w:r>
+      <w:r>
+        <w:rPr>
+          <w:rFonts w:ascii="Calibri" w:hAnsi="Calibri" w:cs="Calibri" w:hint="eastAsia"/>
+          <w:sz w:val="22"/>
+          <w:szCs w:val="22"/>
+        </w:rPr>
+        <w:t>Θ</w:t>
       </w:r>
       <w:r>
         <w:rPr>
@@ -574,47 +414,7 @@
           <w:sz w:val="22"/>
           <w:szCs w:val="22"/>
         </w:rPr>
-        <w:t xml:space="preserve">y su tasa base se fija en 1 para estandarizar la escala temporal. La matriz Q se amplía para </w:t>
-      </w:r>
-      <w:r>
-        <w:rPr>
-          <w:rFonts w:ascii="Calibri" w:hAnsi="Calibri" w:cs="Calibri"/>
-          <w:sz w:val="22"/>
-          <w:szCs w:val="22"/>
-        </w:rPr>
-        <w:t>introduc</w:t>
-      </w:r>
-      <w:r>
-        <w:rPr>
-          <w:rFonts w:ascii="Calibri" w:hAnsi="Calibri" w:cs="Calibri"/>
-          <w:sz w:val="22"/>
-          <w:szCs w:val="22"/>
-        </w:rPr>
-        <w:t>ir</w:t>
-      </w:r>
-      <w:r>
-        <w:rPr>
-          <w:rFonts w:ascii="Calibri" w:hAnsi="Calibri" w:cs="Calibri"/>
-          <w:sz w:val="22"/>
-          <w:szCs w:val="22"/>
-        </w:rPr>
-        <w:t xml:space="preserve"> un par</w:t>
-      </w:r>
-      <w:r>
-        <w:rPr>
-          <w:rFonts w:ascii="Calibri" w:hAnsi="Calibri" w:cs="Calibri"/>
-          <w:sz w:val="22"/>
-          <w:szCs w:val="22"/>
-        </w:rPr>
-        <w:t>á</w:t>
-      </w:r>
-      <w:r>
-        <w:rPr>
-          <w:rFonts w:ascii="Calibri" w:hAnsi="Calibri" w:cs="Calibri"/>
-          <w:sz w:val="22"/>
-          <w:szCs w:val="22"/>
-        </w:rPr>
-        <w:t xml:space="preserve">metro adicional </w:t>
+        <w:t xml:space="preserve">que representan las tasas base </w:t>
       </w:r>
       <w:r>
         <w:rPr>
@@ -622,7 +422,39 @@
           <w:sz w:val="22"/>
           <w:szCs w:val="22"/>
         </w:rPr>
-        <w:t>Ω</w:t>
+        <w:t>Θ</w:t>
+      </w:r>
+      <w:r>
+        <w:rPr>
+          <w:rFonts w:ascii="Calibri" w:hAnsi="Calibri" w:cs="Calibri"/>
+          <w:sz w:val="22"/>
+          <w:szCs w:val="22"/>
+        </w:rPr>
+        <w:t xml:space="preserve">ii y las interacciones entre eventos </w:t>
+      </w:r>
+      <w:r>
+        <w:rPr>
+          <w:rFonts w:ascii="Calibri" w:hAnsi="Calibri" w:cs="Calibri" w:hint="eastAsia"/>
+          <w:sz w:val="22"/>
+          <w:szCs w:val="22"/>
+        </w:rPr>
+        <w:t>Θ</w:t>
+      </w:r>
+      <w:r>
+        <w:rPr>
+          <w:rFonts w:ascii="Calibri" w:hAnsi="Calibri" w:cs="Calibri"/>
+          <w:sz w:val="22"/>
+          <w:szCs w:val="22"/>
+        </w:rPr>
+        <w:t xml:space="preserve">ij. La matriz </w:t>
+      </w:r>
+      <w:r>
+        <w:rPr>
+          <w:rFonts w:ascii="Calibri" w:hAnsi="Calibri" w:cs="Calibri" w:hint="eastAsia"/>
+          <w:sz w:val="22"/>
+          <w:szCs w:val="22"/>
+        </w:rPr>
+        <w:t>Θ</w:t>
       </w:r>
       <w:r>
         <w:rPr>
@@ -638,19 +470,64 @@
           <w:sz w:val="22"/>
           <w:szCs w:val="22"/>
         </w:rPr>
-        <w:t xml:space="preserve">que permite modelar cómo los eventos genéticos afectan </w:t>
-      </w:r>
-      <w:r>
-        <w:rPr>
-          <w:rFonts w:ascii="Calibri" w:hAnsi="Calibri" w:cs="Calibri"/>
-          <w:sz w:val="22"/>
-          <w:szCs w:val="22"/>
-        </w:rPr>
-        <w:t>a la tasa de observación del tumor.</w:t>
+        <w:t>captura la relación de interdependencia entre nodos</w:t>
+      </w:r>
+      <w:r>
+        <w:rPr>
+          <w:rFonts w:ascii="Calibri" w:hAnsi="Calibri" w:cs="Calibri"/>
+          <w:sz w:val="22"/>
+          <w:szCs w:val="22"/>
+        </w:rPr>
+        <w:t xml:space="preserve">. </w:t>
+      </w:r>
+      <w:r>
+        <w:rPr>
+          <w:rFonts w:ascii="Calibri" w:hAnsi="Calibri" w:cs="Calibri"/>
+          <w:sz w:val="22"/>
+          <w:szCs w:val="22"/>
+        </w:rPr>
+        <w:t xml:space="preserve">Cada elemento </w:t>
+      </w:r>
+      <w:r>
+        <w:rPr>
+          <w:rFonts w:ascii="Calibri" w:hAnsi="Calibri" w:cs="Calibri" w:hint="eastAsia"/>
+          <w:sz w:val="22"/>
+          <w:szCs w:val="22"/>
+        </w:rPr>
+        <w:t>Θ</w:t>
+      </w:r>
+      <w:r>
+        <w:rPr>
+          <w:rFonts w:ascii="Calibri" w:hAnsi="Calibri" w:cs="Calibri"/>
+          <w:sz w:val="22"/>
+          <w:szCs w:val="22"/>
+        </w:rPr>
+        <w:t>ij representa el impacto directo del evento j</w:t>
+      </w:r>
+      <w:r>
+        <w:rPr>
+          <w:rFonts w:ascii="Calibri" w:hAnsi="Calibri" w:cs="Calibri"/>
+          <w:sz w:val="22"/>
+          <w:szCs w:val="22"/>
+        </w:rPr>
+        <w:t xml:space="preserve"> </w:t>
+      </w:r>
+      <w:r>
+        <w:rPr>
+          <w:rFonts w:ascii="Calibri" w:hAnsi="Calibri" w:cs="Calibri"/>
+          <w:sz w:val="22"/>
+          <w:szCs w:val="22"/>
+        </w:rPr>
+        <w:t>sobre el evento i en términos del riesgo. La diagonal representa los riesgos sin considerar interdependencias.</w:t>
       </w:r>
     </w:p>
     <w:p>
       <w:pPr>
+        <w:pStyle w:val="Prrafodelista"/>
+        <w:numPr>
+          <w:ilvl w:val="0"/>
+          <w:numId w:val="3"/>
+        </w:numPr>
         <w:jc w:val="both"/>
         <w:rPr>
           <w:rFonts w:ascii="Calibri" w:hAnsi="Calibri" w:cs="Calibri"/>
@@ -664,37 +541,74 @@
           <w:sz w:val="22"/>
           <w:szCs w:val="22"/>
         </w:rPr>
-        <w:t>Estos modelos trabajan con datos transversales, es decir, diferentes sujetos son tomados en tiempos diferentes (independientes). Estos datos se recogen en una matriz binaria en la cual las filas representan pacientes o sujetos y las columnas genes/</w:t>
-      </w:r>
-      <w:proofErr w:type="spellStart"/>
-      <w:r>
-        <w:rPr>
-          <w:rFonts w:ascii="Calibri" w:hAnsi="Calibri" w:cs="Calibri"/>
-          <w:sz w:val="22"/>
-          <w:szCs w:val="22"/>
-        </w:rPr>
-        <w:t>SNPs</w:t>
-      </w:r>
-      <w:proofErr w:type="spellEnd"/>
-      <w:r>
-        <w:rPr>
-          <w:rFonts w:ascii="Calibri" w:hAnsi="Calibri" w:cs="Calibri"/>
-          <w:sz w:val="22"/>
-          <w:szCs w:val="22"/>
-        </w:rPr>
-        <w:t>/etc. Cada celda puede contener un 1 si el evento está presente o un 0 si</w:t>
-      </w:r>
-      <w:r>
-        <w:rPr>
-          <w:rFonts w:ascii="Calibri" w:hAnsi="Calibri" w:cs="Calibri"/>
-          <w:sz w:val="22"/>
-          <w:szCs w:val="22"/>
-        </w:rPr>
-        <w:t>no lo está.</w:t>
+        <w:t xml:space="preserve">El nuevo </w:t>
+      </w:r>
+      <w:r>
+        <w:rPr>
+          <w:rFonts w:ascii="Calibri" w:hAnsi="Calibri" w:cs="Calibri"/>
+          <w:b/>
+          <w:bCs/>
+          <w:sz w:val="22"/>
+          <w:szCs w:val="22"/>
+        </w:rPr>
+        <w:t>modelo oMHN</w:t>
+      </w:r>
+      <w:r>
+        <w:rPr>
+          <w:rFonts w:ascii="Calibri" w:hAnsi="Calibri" w:cs="Calibri"/>
+          <w:sz w:val="22"/>
+          <w:szCs w:val="22"/>
+        </w:rPr>
+        <w:t xml:space="preserve"> incorpora explícitamente el evento de observación en la red causal como un evento adicional. La matriz Q se amplía para </w:t>
+      </w:r>
+      <w:r>
+        <w:rPr>
+          <w:rFonts w:ascii="Calibri" w:hAnsi="Calibri" w:cs="Calibri"/>
+          <w:sz w:val="22"/>
+          <w:szCs w:val="22"/>
+        </w:rPr>
+        <w:t>introducir un par</w:t>
+      </w:r>
+      <w:r>
+        <w:rPr>
+          <w:rFonts w:ascii="Calibri" w:hAnsi="Calibri" w:cs="Calibri"/>
+          <w:sz w:val="22"/>
+          <w:szCs w:val="22"/>
+        </w:rPr>
+        <w:t>á</w:t>
+      </w:r>
+      <w:r>
+        <w:rPr>
+          <w:rFonts w:ascii="Calibri" w:hAnsi="Calibri" w:cs="Calibri"/>
+          <w:sz w:val="22"/>
+          <w:szCs w:val="22"/>
+        </w:rPr>
+        <w:t xml:space="preserve">metro adicional </w:t>
+      </w:r>
+      <w:r>
+        <w:rPr>
+          <w:rFonts w:ascii="Calibri" w:hAnsi="Calibri" w:cs="Calibri" w:hint="eastAsia"/>
+          <w:sz w:val="22"/>
+          <w:szCs w:val="22"/>
+        </w:rPr>
+        <w:t>Ω</w:t>
+      </w:r>
+      <w:r>
+        <w:rPr>
+          <w:rFonts w:ascii="Calibri" w:hAnsi="Calibri" w:cs="Calibri"/>
+          <w:sz w:val="22"/>
+          <w:szCs w:val="22"/>
+        </w:rPr>
+        <w:t xml:space="preserve"> que permite modelar cómo los eventos genéticos afectan a la tasa de observación del tumor.</w:t>
       </w:r>
     </w:p>
     <w:p>
       <w:pPr>
+        <w:pStyle w:val="Prrafodelista"/>
+        <w:numPr>
+          <w:ilvl w:val="0"/>
+          <w:numId w:val="3"/>
+        </w:numPr>
         <w:jc w:val="both"/>
         <w:rPr>
           <w:rFonts w:ascii="Calibri" w:hAnsi="Calibri" w:cs="Calibri"/>
@@ -708,15 +622,47 @@
           <w:sz w:val="22"/>
           <w:szCs w:val="22"/>
         </w:rPr>
-        <w:t>Tanto en Python como en R existen dos paquetes que nos permiten poder realizar modelo MHN. Pasamos a analizar cada uno de ellos</w:t>
-      </w:r>
-      <w:r>
-        <w:rPr>
-          <w:rFonts w:ascii="Calibri" w:hAnsi="Calibri" w:cs="Calibri"/>
-          <w:sz w:val="22"/>
-          <w:szCs w:val="22"/>
-        </w:rPr>
-        <w:t>.</w:t>
+        <w:t>Estos modelos trabajan con datos transversales</w:t>
+      </w:r>
+      <w:r>
+        <w:rPr>
+          <w:rFonts w:ascii="Calibri" w:hAnsi="Calibri" w:cs="Calibri"/>
+          <w:sz w:val="22"/>
+          <w:szCs w:val="22"/>
+        </w:rPr>
+        <w:t xml:space="preserve"> (cross-sectional data</w:t>
+      </w:r>
+      <w:r>
+        <w:rPr>
+          <w:rFonts w:ascii="Calibri" w:hAnsi="Calibri" w:cs="Calibri"/>
+          <w:sz w:val="22"/>
+          <w:szCs w:val="22"/>
+        </w:rPr>
+        <w:t>: muestras independientes y cada sujeto 1 vez</w:t>
+      </w:r>
+      <w:r>
+        <w:rPr>
+          <w:rFonts w:ascii="Calibri" w:hAnsi="Calibri" w:cs="Calibri"/>
+          <w:sz w:val="22"/>
+          <w:szCs w:val="22"/>
+        </w:rPr>
+        <w:t xml:space="preserve">) que </w:t>
+      </w:r>
+      <w:r>
+        <w:rPr>
+          <w:rFonts w:ascii="Calibri" w:hAnsi="Calibri" w:cs="Calibri"/>
+          <w:sz w:val="22"/>
+          <w:szCs w:val="22"/>
+        </w:rPr>
+        <w:t>se recogen en una matriz binaria en la cual las filas representan pacientes o sujetos y las columnas genes/SNPs/etc. Cada celda puede contener un 1 si el evento está presente o un 0 si</w:t>
+      </w:r>
+      <w:r>
+        <w:rPr>
+          <w:rFonts w:ascii="Calibri" w:hAnsi="Calibri" w:cs="Calibri"/>
+          <w:sz w:val="22"/>
+          <w:szCs w:val="22"/>
+        </w:rPr>
+        <w:t>no lo está.</w:t>
       </w:r>
     </w:p>
     <w:p>
@@ -728,26 +674,54 @@
           <w:szCs w:val="22"/>
         </w:rPr>
       </w:pPr>
-    </w:p>
-    <w:p>
-      <w:pPr>
-        <w:jc w:val="both"/>
-        <w:rPr>
-          <w:rFonts w:ascii="Calibri" w:hAnsi="Calibri" w:cs="Calibri"/>
-          <w:sz w:val="22"/>
-          <w:szCs w:val="22"/>
-        </w:rPr>
-      </w:pPr>
-    </w:p>
-    <w:p>
-      <w:pPr>
-        <w:jc w:val="both"/>
-        <w:rPr>
-          <w:rFonts w:ascii="Calibri" w:hAnsi="Calibri" w:cs="Calibri"/>
-          <w:sz w:val="22"/>
-          <w:szCs w:val="22"/>
-        </w:rPr>
-      </w:pPr>
+      <w:r>
+        <w:rPr>
+          <w:rFonts w:ascii="Calibri" w:hAnsi="Calibri" w:cs="Calibri"/>
+          <w:sz w:val="22"/>
+          <w:szCs w:val="22"/>
+        </w:rPr>
+        <w:t xml:space="preserve">Tanto en Python como en R existen dos paquetes que nos permiten poder </w:t>
+      </w:r>
+      <w:r>
+        <w:rPr>
+          <w:rFonts w:ascii="Calibri" w:hAnsi="Calibri" w:cs="Calibri"/>
+          <w:sz w:val="22"/>
+          <w:szCs w:val="22"/>
+        </w:rPr>
+        <w:t>calcula</w:t>
+      </w:r>
+      <w:r>
+        <w:rPr>
+          <w:rFonts w:ascii="Calibri" w:hAnsi="Calibri" w:cs="Calibri"/>
+          <w:sz w:val="22"/>
+          <w:szCs w:val="22"/>
+        </w:rPr>
+        <w:t>r modelo</w:t>
+      </w:r>
+      <w:r>
+        <w:rPr>
+          <w:rFonts w:ascii="Calibri" w:hAnsi="Calibri" w:cs="Calibri"/>
+          <w:sz w:val="22"/>
+          <w:szCs w:val="22"/>
+        </w:rPr>
+        <w:t>s</w:t>
+      </w:r>
+      <w:r>
+        <w:rPr>
+          <w:rFonts w:ascii="Calibri" w:hAnsi="Calibri" w:cs="Calibri"/>
+          <w:sz w:val="22"/>
+          <w:szCs w:val="22"/>
+        </w:rPr>
+        <w:t xml:space="preserve"> MHN. Pasamos a analizar cada uno de ellos</w:t>
+      </w:r>
+      <w:r>
+        <w:rPr>
+          <w:rFonts w:ascii="Calibri" w:hAnsi="Calibri" w:cs="Calibri"/>
+          <w:sz w:val="22"/>
+          <w:szCs w:val="22"/>
+        </w:rPr>
+        <w:t>.</w:t>
+      </w:r>
     </w:p>
     <w:p>
       <w:pPr>
@@ -768,6 +742,7 @@
           <w:sz w:val="28"/>
           <w:szCs w:val="28"/>
         </w:rPr>
+        <w:lastRenderedPageBreak/>
         <w:t>FUNCIONALIDADES PYTHON</w:t>
       </w:r>
     </w:p>
@@ -786,87 +761,15 @@
           <w:sz w:val="22"/>
           <w:szCs w:val="22"/>
         </w:rPr>
-        <w:t xml:space="preserve">El módulo </w:t>
-      </w:r>
-      <w:proofErr w:type="spellStart"/>
-      <w:r>
-        <w:rPr>
-          <w:rFonts w:ascii="Calibri" w:hAnsi="Calibri" w:cs="Calibri"/>
-          <w:sz w:val="22"/>
-          <w:szCs w:val="22"/>
-        </w:rPr>
-        <w:t>mhn</w:t>
-      </w:r>
-      <w:proofErr w:type="spellEnd"/>
-      <w:r>
-        <w:rPr>
-          <w:rFonts w:ascii="Calibri" w:hAnsi="Calibri" w:cs="Calibri"/>
-          <w:sz w:val="22"/>
-          <w:szCs w:val="22"/>
-        </w:rPr>
-        <w:t xml:space="preserve"> de Python</w:t>
-      </w:r>
-      <w:r>
-        <w:rPr>
-          <w:rFonts w:ascii="Calibri" w:hAnsi="Calibri" w:cs="Calibri"/>
-          <w:sz w:val="22"/>
-          <w:szCs w:val="22"/>
-        </w:rPr>
-        <w:t xml:space="preserve"> permiten calcular tanto el modelo </w:t>
-      </w:r>
-      <w:proofErr w:type="spellStart"/>
-      <w:r>
-        <w:rPr>
-          <w:rFonts w:ascii="Calibri" w:hAnsi="Calibri" w:cs="Calibri"/>
-          <w:sz w:val="22"/>
-          <w:szCs w:val="22"/>
-        </w:rPr>
-        <w:t>cMHN</w:t>
-      </w:r>
-      <w:proofErr w:type="spellEnd"/>
-      <w:r>
-        <w:rPr>
-          <w:rFonts w:ascii="Calibri" w:hAnsi="Calibri" w:cs="Calibri"/>
-          <w:sz w:val="22"/>
-          <w:szCs w:val="22"/>
-        </w:rPr>
-        <w:t xml:space="preserve"> como el corregido </w:t>
-      </w:r>
-      <w:proofErr w:type="spellStart"/>
-      <w:r>
-        <w:rPr>
-          <w:rFonts w:ascii="Calibri" w:hAnsi="Calibri" w:cs="Calibri"/>
-          <w:sz w:val="22"/>
-          <w:szCs w:val="22"/>
-        </w:rPr>
-        <w:t>oMHN</w:t>
-      </w:r>
-      <w:proofErr w:type="spellEnd"/>
-      <w:r>
-        <w:rPr>
-          <w:rFonts w:ascii="Calibri" w:hAnsi="Calibri" w:cs="Calibri"/>
-          <w:sz w:val="22"/>
-          <w:szCs w:val="22"/>
-        </w:rPr>
-        <w:t xml:space="preserve">, para ello escogemos la función </w:t>
-      </w:r>
-      <w:proofErr w:type="spellStart"/>
-      <w:r>
-        <w:rPr>
-          <w:rFonts w:ascii="Calibri" w:hAnsi="Calibri" w:cs="Calibri"/>
-          <w:sz w:val="22"/>
-          <w:szCs w:val="22"/>
-        </w:rPr>
-        <w:t>optimizer</w:t>
-      </w:r>
-      <w:proofErr w:type="spellEnd"/>
-      <w:r>
-        <w:rPr>
-          <w:rFonts w:ascii="Calibri" w:hAnsi="Calibri" w:cs="Calibri"/>
-          <w:sz w:val="22"/>
-          <w:szCs w:val="22"/>
-        </w:rPr>
-        <w:t xml:space="preserve"> e indica</w:t>
+        <w:t>El módulo mhn de Python</w:t>
+      </w:r>
+      <w:r>
+        <w:rPr>
+          <w:rFonts w:ascii="Calibri" w:hAnsi="Calibri" w:cs="Calibri"/>
+          <w:sz w:val="22"/>
+          <w:szCs w:val="22"/>
+        </w:rPr>
+        <w:t xml:space="preserve"> permiten calcular tanto el modelo cMHN como el corregido oMHN, para ello escogemos la función optimizer e indica</w:t>
       </w:r>
       <w:r>
         <w:rPr>
@@ -882,43 +785,7 @@
           <w:sz w:val="22"/>
           <w:szCs w:val="22"/>
         </w:rPr>
-        <w:t xml:space="preserve"> cuál usaremos: </w:t>
-      </w:r>
-      <w:proofErr w:type="spellStart"/>
-      <w:r>
-        <w:rPr>
-          <w:rFonts w:ascii="Calibri" w:hAnsi="Calibri" w:cs="Calibri"/>
-          <w:sz w:val="22"/>
-          <w:szCs w:val="22"/>
-        </w:rPr>
-        <w:t>cMHNOptimizer</w:t>
-      </w:r>
-      <w:proofErr w:type="spellEnd"/>
-      <w:r>
-        <w:rPr>
-          <w:rFonts w:ascii="Calibri" w:hAnsi="Calibri" w:cs="Calibri"/>
-          <w:sz w:val="22"/>
-          <w:szCs w:val="22"/>
-        </w:rPr>
-        <w:t xml:space="preserve"> u </w:t>
-      </w:r>
-      <w:proofErr w:type="spellStart"/>
-      <w:r>
-        <w:rPr>
-          <w:rFonts w:ascii="Calibri" w:hAnsi="Calibri" w:cs="Calibri"/>
-          <w:sz w:val="22"/>
-          <w:szCs w:val="22"/>
-        </w:rPr>
-        <w:t>oMHNOptimizer</w:t>
-      </w:r>
-      <w:proofErr w:type="spellEnd"/>
-      <w:r>
-        <w:rPr>
-          <w:rFonts w:ascii="Calibri" w:hAnsi="Calibri" w:cs="Calibri"/>
-          <w:sz w:val="22"/>
-          <w:szCs w:val="22"/>
-        </w:rPr>
-        <w:t>.</w:t>
+        <w:t xml:space="preserve"> cuál usaremos: cMHNOptimizer u oMHNOptimizer.</w:t>
       </w:r>
     </w:p>
     <w:p>
@@ -960,95 +827,31 @@
           <w:sz w:val="22"/>
           <w:szCs w:val="22"/>
         </w:rPr>
-        <w:t xml:space="preserve"> de matriz binaria, la cual se puede importar con el módulo pandas y la función </w:t>
-      </w:r>
-      <w:proofErr w:type="spellStart"/>
-      <w:r>
-        <w:rPr>
-          <w:rFonts w:ascii="Calibri" w:hAnsi="Calibri" w:cs="Calibri"/>
-          <w:sz w:val="22"/>
-          <w:szCs w:val="22"/>
-        </w:rPr>
-        <w:t>load</w:t>
-      </w:r>
-      <w:r>
-        <w:rPr>
-          <w:rFonts w:ascii="Calibri" w:hAnsi="Calibri" w:cs="Calibri"/>
-          <w:sz w:val="22"/>
-          <w:szCs w:val="22"/>
-        </w:rPr>
-        <w:t>_data_</w:t>
-      </w:r>
-      <w:proofErr w:type="gramStart"/>
-      <w:r>
-        <w:rPr>
-          <w:rFonts w:ascii="Calibri" w:hAnsi="Calibri" w:cs="Calibri"/>
-          <w:sz w:val="22"/>
-          <w:szCs w:val="22"/>
-        </w:rPr>
-        <w:t>matrix</w:t>
-      </w:r>
-      <w:proofErr w:type="spellEnd"/>
-      <w:r>
-        <w:rPr>
-          <w:rFonts w:ascii="Calibri" w:hAnsi="Calibri" w:cs="Calibri"/>
-          <w:sz w:val="22"/>
-          <w:szCs w:val="22"/>
-        </w:rPr>
-        <w:t>(</w:t>
-      </w:r>
-      <w:proofErr w:type="gramEnd"/>
-      <w:r>
-        <w:rPr>
-          <w:rFonts w:ascii="Calibri" w:hAnsi="Calibri" w:cs="Calibri"/>
-          <w:sz w:val="22"/>
-          <w:szCs w:val="22"/>
-        </w:rPr>
-        <w:t xml:space="preserve">) o, en caso de que esté en un fichero </w:t>
-      </w:r>
-      <w:proofErr w:type="spellStart"/>
-      <w:r>
-        <w:rPr>
-          <w:rFonts w:ascii="Calibri" w:hAnsi="Calibri" w:cs="Calibri"/>
-          <w:sz w:val="22"/>
-          <w:szCs w:val="22"/>
-        </w:rPr>
-        <w:t>csv</w:t>
-      </w:r>
-      <w:proofErr w:type="spellEnd"/>
-      <w:r>
-        <w:rPr>
-          <w:rFonts w:ascii="Calibri" w:hAnsi="Calibri" w:cs="Calibri"/>
-          <w:sz w:val="22"/>
-          <w:szCs w:val="22"/>
-        </w:rPr>
-        <w:t xml:space="preserve">, directamente </w:t>
-      </w:r>
-      <w:r>
-        <w:rPr>
-          <w:rFonts w:ascii="Calibri" w:hAnsi="Calibri" w:cs="Calibri"/>
-          <w:sz w:val="22"/>
-          <w:szCs w:val="22"/>
-        </w:rPr>
-        <w:t xml:space="preserve">con </w:t>
-      </w:r>
-      <w:proofErr w:type="spellStart"/>
-      <w:r>
-        <w:rPr>
-          <w:rFonts w:ascii="Calibri" w:hAnsi="Calibri" w:cs="Calibri"/>
-          <w:sz w:val="22"/>
-          <w:szCs w:val="22"/>
-        </w:rPr>
-        <w:t>load_data_from_csv</w:t>
-      </w:r>
-      <w:proofErr w:type="spellEnd"/>
-      <w:r>
-        <w:rPr>
-          <w:rFonts w:ascii="Calibri" w:hAnsi="Calibri" w:cs="Calibri"/>
-          <w:sz w:val="22"/>
-          <w:szCs w:val="22"/>
-        </w:rPr>
-        <w:t>().</w:t>
+        <w:t xml:space="preserve"> de matriz binaria, la cual se puede importar con el módulo pandas y la función load</w:t>
+      </w:r>
+      <w:r>
+        <w:rPr>
+          <w:rFonts w:ascii="Calibri" w:hAnsi="Calibri" w:cs="Calibri"/>
+          <w:sz w:val="22"/>
+          <w:szCs w:val="22"/>
+        </w:rPr>
+        <w:t>_data_matrix</w:t>
+      </w:r>
+      <w:r>
+        <w:rPr>
+          <w:rFonts w:ascii="Calibri" w:hAnsi="Calibri" w:cs="Calibri"/>
+          <w:sz w:val="22"/>
+          <w:szCs w:val="22"/>
+        </w:rPr>
+        <w:t xml:space="preserve">() o, en caso de que esté en un fichero csv, directamente </w:t>
+      </w:r>
+      <w:r>
+        <w:rPr>
+          <w:rFonts w:ascii="Calibri" w:hAnsi="Calibri" w:cs="Calibri"/>
+          <w:sz w:val="22"/>
+          <w:szCs w:val="22"/>
+        </w:rPr>
+        <w:t>con load_data_from_csv().</w:t>
       </w:r>
     </w:p>
     <w:p>
@@ -1098,43 +901,7 @@
           <w:sz w:val="22"/>
           <w:szCs w:val="22"/>
         </w:rPr>
-        <w:t xml:space="preserve"> con la función </w:t>
-      </w:r>
-      <w:proofErr w:type="spellStart"/>
-      <w:r>
-        <w:rPr>
-          <w:rFonts w:ascii="Calibri" w:hAnsi="Calibri" w:cs="Calibri"/>
-          <w:sz w:val="22"/>
-          <w:szCs w:val="22"/>
-        </w:rPr>
-        <w:t>set_</w:t>
-      </w:r>
-      <w:proofErr w:type="gramStart"/>
-      <w:r>
-        <w:rPr>
-          <w:rFonts w:ascii="Calibri" w:hAnsi="Calibri" w:cs="Calibri"/>
-          <w:sz w:val="22"/>
-          <w:szCs w:val="22"/>
-        </w:rPr>
-        <w:t>penalty</w:t>
-      </w:r>
-      <w:proofErr w:type="spellEnd"/>
-      <w:r>
-        <w:rPr>
-          <w:rFonts w:ascii="Calibri" w:hAnsi="Calibri" w:cs="Calibri"/>
-          <w:sz w:val="22"/>
-          <w:szCs w:val="22"/>
-        </w:rPr>
-        <w:t>(</w:t>
-      </w:r>
-      <w:proofErr w:type="gramEnd"/>
-      <w:r>
-        <w:rPr>
-          <w:rFonts w:ascii="Calibri" w:hAnsi="Calibri" w:cs="Calibri"/>
-          <w:sz w:val="22"/>
-          <w:szCs w:val="22"/>
-        </w:rPr>
-        <w:t>) que nos permite escoger entre</w:t>
+        <w:t xml:space="preserve"> con la función set_penalty() que nos permite escoger entre</w:t>
       </w:r>
       <w:r>
         <w:rPr>
@@ -1240,43 +1007,15 @@
           <w:sz w:val="22"/>
           <w:szCs w:val="22"/>
         </w:rPr>
-        <w:t xml:space="preserve">con la función </w:t>
-      </w:r>
-      <w:proofErr w:type="spellStart"/>
-      <w:r>
-        <w:rPr>
-          <w:rFonts w:ascii="Calibri" w:hAnsi="Calibri" w:cs="Calibri"/>
-          <w:sz w:val="22"/>
-          <w:szCs w:val="22"/>
-        </w:rPr>
-        <w:t>lambda_from_</w:t>
-      </w:r>
-      <w:proofErr w:type="gramStart"/>
-      <w:r>
-        <w:rPr>
-          <w:rFonts w:ascii="Calibri" w:hAnsi="Calibri" w:cs="Calibri"/>
-          <w:sz w:val="22"/>
-          <w:szCs w:val="22"/>
-        </w:rPr>
-        <w:t>cv</w:t>
-      </w:r>
-      <w:proofErr w:type="spellEnd"/>
-      <w:r>
-        <w:rPr>
-          <w:rFonts w:ascii="Calibri" w:hAnsi="Calibri" w:cs="Calibri"/>
-          <w:sz w:val="22"/>
-          <w:szCs w:val="22"/>
-        </w:rPr>
-        <w:t>(</w:t>
-      </w:r>
-      <w:proofErr w:type="gramEnd"/>
-      <w:r>
-        <w:rPr>
-          <w:rFonts w:ascii="Calibri" w:hAnsi="Calibri" w:cs="Calibri"/>
-          <w:sz w:val="22"/>
-          <w:szCs w:val="22"/>
-        </w:rPr>
-        <w:t xml:space="preserve">) </w:t>
+        <w:t>con la función lambda_from_cv</w:t>
+      </w:r>
+      <w:r>
+        <w:rPr>
+          <w:rFonts w:ascii="Calibri" w:hAnsi="Calibri" w:cs="Calibri"/>
+          <w:sz w:val="22"/>
+          <w:szCs w:val="22"/>
+        </w:rPr>
+        <w:t xml:space="preserve">() </w:t>
       </w:r>
       <w:r>
         <w:rPr>
@@ -1356,25 +1095,7 @@
           <w:sz w:val="22"/>
           <w:szCs w:val="22"/>
         </w:rPr>
-        <w:t xml:space="preserve">Para ello indicamos los siguientes </w:t>
-      </w:r>
-      <w:proofErr w:type="spellStart"/>
-      <w:r>
-        <w:rPr>
-          <w:rFonts w:ascii="Calibri" w:hAnsi="Calibri" w:cs="Calibri"/>
-          <w:sz w:val="22"/>
-          <w:szCs w:val="22"/>
-        </w:rPr>
-        <w:t>hiperparámetros</w:t>
-      </w:r>
-      <w:proofErr w:type="spellEnd"/>
-      <w:r>
-        <w:rPr>
-          <w:rFonts w:ascii="Calibri" w:hAnsi="Calibri" w:cs="Calibri"/>
-          <w:sz w:val="22"/>
-          <w:szCs w:val="22"/>
-        </w:rPr>
-        <w:t xml:space="preserve">: </w:t>
+        <w:t xml:space="preserve">Para ello indicamos los siguientes hiperparámetros: </w:t>
       </w:r>
       <w:r>
         <w:rPr>
@@ -1398,25 +1119,7 @@
           <w:sz w:val="22"/>
           <w:szCs w:val="22"/>
         </w:rPr>
-        <w:t xml:space="preserve">la cantidad de pasos que hay que dar entre estos límites y la cantidad de </w:t>
-      </w:r>
-      <w:proofErr w:type="spellStart"/>
-      <w:r>
-        <w:rPr>
-          <w:rFonts w:ascii="Calibri" w:hAnsi="Calibri" w:cs="Calibri"/>
-          <w:sz w:val="22"/>
-          <w:szCs w:val="22"/>
-        </w:rPr>
-        <w:t>folds</w:t>
-      </w:r>
-      <w:proofErr w:type="spellEnd"/>
-      <w:r>
-        <w:rPr>
-          <w:rFonts w:ascii="Calibri" w:hAnsi="Calibri" w:cs="Calibri"/>
-          <w:sz w:val="22"/>
-          <w:szCs w:val="22"/>
-        </w:rPr>
-        <w:t xml:space="preserve"> en que se quieren dividir los datos para la validación cruzada. </w:t>
+        <w:t xml:space="preserve">la cantidad de pasos que hay que dar entre estos límites y la cantidad de folds en que se quieren dividir los datos para la validación cruzada. </w:t>
       </w:r>
     </w:p>
     <w:p>
@@ -1450,35 +1153,15 @@
           <w:sz w:val="22"/>
           <w:szCs w:val="22"/>
         </w:rPr>
-        <w:t xml:space="preserve"> empleando la función </w:t>
-      </w:r>
-      <w:proofErr w:type="spellStart"/>
-      <w:proofErr w:type="gramStart"/>
-      <w:r>
-        <w:rPr>
-          <w:rFonts w:ascii="Calibri" w:hAnsi="Calibri" w:cs="Calibri"/>
-          <w:sz w:val="22"/>
-          <w:szCs w:val="22"/>
-        </w:rPr>
-        <w:t>train</w:t>
-      </w:r>
-      <w:proofErr w:type="spellEnd"/>
-      <w:r>
-        <w:rPr>
-          <w:rFonts w:ascii="Calibri" w:hAnsi="Calibri" w:cs="Calibri"/>
-          <w:sz w:val="22"/>
-          <w:szCs w:val="22"/>
-        </w:rPr>
-        <w:t>(</w:t>
-      </w:r>
-      <w:proofErr w:type="gramEnd"/>
-      <w:r>
-        <w:rPr>
-          <w:rFonts w:ascii="Calibri" w:hAnsi="Calibri" w:cs="Calibri"/>
-          <w:sz w:val="22"/>
-          <w:szCs w:val="22"/>
-        </w:rPr>
-        <w:t>)</w:t>
+        <w:t xml:space="preserve"> empleando la función train</w:t>
+      </w:r>
+      <w:r>
+        <w:rPr>
+          <w:rFonts w:ascii="Calibri" w:hAnsi="Calibri" w:cs="Calibri"/>
+          <w:sz w:val="22"/>
+          <w:szCs w:val="22"/>
+        </w:rPr>
+        <w:t>()</w:t>
       </w:r>
       <w:r>
         <w:rPr>
@@ -1510,25 +1193,7 @@
           <w:sz w:val="22"/>
           <w:szCs w:val="22"/>
         </w:rPr>
-        <w:t xml:space="preserve">resultados se pueden guardar en formato </w:t>
-      </w:r>
-      <w:proofErr w:type="spellStart"/>
-      <w:r>
-        <w:rPr>
-          <w:rFonts w:ascii="Calibri" w:hAnsi="Calibri" w:cs="Calibri"/>
-          <w:sz w:val="22"/>
-          <w:szCs w:val="22"/>
-        </w:rPr>
-        <w:t>csv</w:t>
-      </w:r>
-      <w:proofErr w:type="spellEnd"/>
-      <w:r>
-        <w:rPr>
-          <w:rFonts w:ascii="Calibri" w:hAnsi="Calibri" w:cs="Calibri"/>
-          <w:sz w:val="22"/>
-          <w:szCs w:val="22"/>
-        </w:rPr>
-        <w:t xml:space="preserve"> </w:t>
+        <w:t xml:space="preserve">resultados se pueden guardar en formato csv </w:t>
       </w:r>
       <w:r>
         <w:rPr>
@@ -1544,38 +1209,8 @@
           <w:sz w:val="22"/>
           <w:szCs w:val="22"/>
         </w:rPr>
-        <w:t xml:space="preserve"> </w:t>
-      </w:r>
-      <w:proofErr w:type="spellStart"/>
-      <w:r>
-        <w:rPr>
-          <w:rFonts w:ascii="Calibri" w:hAnsi="Calibri" w:cs="Calibri"/>
-          <w:sz w:val="22"/>
-          <w:szCs w:val="22"/>
-        </w:rPr>
-        <w:t>json</w:t>
-      </w:r>
-      <w:proofErr w:type="spellEnd"/>
-      <w:r>
-        <w:rPr>
-          <w:rFonts w:ascii="Calibri" w:hAnsi="Calibri" w:cs="Calibri"/>
-          <w:sz w:val="22"/>
-          <w:szCs w:val="22"/>
-        </w:rPr>
-        <w:t xml:space="preserve"> con </w:t>
-      </w:r>
-      <w:proofErr w:type="spellStart"/>
-      <w:proofErr w:type="gramStart"/>
-      <w:r>
-        <w:rPr>
-          <w:rFonts w:ascii="Calibri" w:hAnsi="Calibri" w:cs="Calibri"/>
-          <w:sz w:val="22"/>
-          <w:szCs w:val="22"/>
-        </w:rPr>
-        <w:t>result.save</w:t>
-      </w:r>
-      <w:proofErr w:type="spellEnd"/>
-      <w:proofErr w:type="gramEnd"/>
+        <w:t xml:space="preserve"> json con result.save</w:t>
+      </w:r>
       <w:r>
         <w:rPr>
           <w:rFonts w:ascii="Calibri" w:hAnsi="Calibri" w:cs="Calibri"/>
@@ -1596,66 +1231,8 @@
 </w:document>
 </file>
 
-<file path=word/comments.xml><?xml version="1.0" encoding="utf-8"?>
-<w:comments xmlns:wpc="http://schemas.microsoft.com/office/word/2010/wordprocessingCanvas" xmlns:cx="http://schemas.microsoft.com/office/drawing/2014/chartex" xmlns:cx1="http://schemas.microsoft.com/office/drawing/2015/9/8/chartex" xmlns:cx2="http://schemas.microsoft.com/office/drawing/2015/10/21/chartex" xmlns:cx3="http://schemas.microsoft.com/office/drawing/2016/5/9/chartex" xmlns:cx4="http://schemas.microsoft.com/office/drawing/2016/5/10/chartex" xmlns:cx5="http://schemas.microsoft.com/office/drawing/2016/5/11/chartex" xmlns:cx6="http://schemas.microsoft.com/office/drawing/2016/5/12/chartex" xmlns:cx7="http://schemas.microsoft.com/office/drawing/2016/5/13/chartex" xmlns:cx8="http://schemas.microsoft.com/office/drawing/2016/5/14/chartex" xmlns:mc="http://schemas.openxmlformats.org/markup-compatibility/2006" xmlns:aink="http://schemas.microsoft.com/office/drawing/2016/ink" xmlns:am3d="http://schemas.microsoft.com/office/drawing/2017/model3d" xmlns:o="urn:schemas-microsoft-com:office:office" xmlns:oel="http://schemas.microsoft.com/office/2019/extlst" xmlns:r="http://schemas.openxmlformats.org/officeDocument/2006/relationships" xmlns:m="http://schemas.openxmlformats.org/officeDocument/2006/math" xmlns:v="urn:schemas-microsoft-com:vml" xmlns:wp14="http://schemas.microsoft.com/office/word/2010/wordprocessingDrawing" xmlns:wp="http://schemas.openxmlformats.org/drawingml/2006/wordprocessingDrawing" xmlns:w10="urn:schemas-microsoft-com:office:word" xmlns:w="http://schemas.openxmlformats.org/wordprocessingml/2006/main" xmlns:w14="http://schemas.microsoft.com/office/word/2010/wordml" xmlns:w15="http://schemas.microsoft.com/office/word/2012/wordml" xmlns:w16cex="http://schemas.microsoft.com/office/word/2018/wordml/cex" xmlns:w16cid="http://schemas.microsoft.com/office/word/2016/wordml/cid" xmlns:w16="http://schemas.microsoft.com/office/word/2018/wordml" xmlns:w16du="http://schemas.microsoft.com/office/word/2023/wordml/word16du" xmlns:w16sdtdh="http://schemas.microsoft.com/office/word/2020/wordml/sdtdatahash" xmlns:w16sdtfl="http://schemas.microsoft.com/office/word/2024/wordml/sdtformatlock" xmlns:w16se="http://schemas.microsoft.com/office/word/2015/wordml/symex" xmlns:wpg="http://schemas.microsoft.com/office/word/2010/wordprocessingGroup" xmlns:wpi="http://schemas.microsoft.com/office/word/2010/wordprocessingInk" xmlns:wne="http://schemas.microsoft.com/office/word/2006/wordml" xmlns:wps="http://schemas.microsoft.com/office/word/2010/wordprocessingShape" mc:Ignorable="w14 w15 w16se w16cid w16 w16cex w16sdtdh w16sdtfl w16du wp14">
-  <w:comment w:id="0" w:author="Sandra Mingo Ramírez" w:date="2025-01-05T20:53:00Z" w:initials="SM">
-    <w:p>
-      <w:pPr>
-        <w:pStyle w:val="Textocomentario"/>
-      </w:pPr>
-      <w:r>
-        <w:rPr>
-          <w:rStyle w:val="Refdecomentario"/>
-        </w:rPr>
-        <w:annotationRef/>
-      </w:r>
-      <w:r>
-        <w:t>¿No es lo mismo que dices en la frase anterior?</w:t>
-      </w:r>
-    </w:p>
-  </w:comment>
-  <w:comment w:id="1" w:author="Sandra Mingo Ramírez" w:date="2025-01-05T20:56:00Z" w:initials="SM">
-    <w:p>
-      <w:pPr>
-        <w:pStyle w:val="Textocomentario"/>
-      </w:pPr>
-      <w:r>
-        <w:rPr>
-          <w:rStyle w:val="Refdecomentario"/>
-        </w:rPr>
-        <w:annotationRef/>
-      </w:r>
-      <w:r>
-        <w:t>Yo quizás no entraría en lo de Theta_ii y Theta_ij porque se pueden liar, si no que pondría una matriz Q en las diapositivas y señalaría las celdas correspondientes o algo así, por ahorrar confusión</w:t>
-      </w:r>
-    </w:p>
-  </w:comment>
-</w:comments>
-</file>
-
-<file path=word/commentsExtended.xml><?xml version="1.0" encoding="utf-8"?>
-<w15:commentsEx xmlns:wpc="http://schemas.microsoft.com/office/word/2010/wordprocessingCanvas" xmlns:cx="http://schemas.microsoft.com/office/drawing/2014/chartex" xmlns:cx1="http://schemas.microsoft.com/office/drawing/2015/9/8/chartex" xmlns:cx2="http://schemas.microsoft.com/office/drawing/2015/10/21/chartex" xmlns:cx3="http://schemas.microsoft.com/office/drawing/2016/5/9/chartex" xmlns:cx4="http://schemas.microsoft.com/office/drawing/2016/5/10/chartex" xmlns:cx5="http://schemas.microsoft.com/office/drawing/2016/5/11/chartex" xmlns:cx6="http://schemas.microsoft.com/office/drawing/2016/5/12/chartex" xmlns:cx7="http://schemas.microsoft.com/office/drawing/2016/5/13/chartex" xmlns:cx8="http://schemas.microsoft.com/office/drawing/2016/5/14/chartex" xmlns:mc="http://schemas.openxmlformats.org/markup-compatibility/2006" xmlns:aink="http://schemas.microsoft.com/office/drawing/2016/ink" xmlns:am3d="http://schemas.microsoft.com/office/drawing/2017/model3d" xmlns:o="urn:schemas-microsoft-com:office:office" xmlns:oel="http://schemas.microsoft.com/office/2019/extlst" xmlns:r="http://schemas.openxmlformats.org/officeDocument/2006/relationships" xmlns:m="http://schemas.openxmlformats.org/officeDocument/2006/math" xmlns:v="urn:schemas-microsoft-com:vml" xmlns:wp14="http://schemas.microsoft.com/office/word/2010/wordprocessingDrawing" xmlns:wp="http://schemas.openxmlformats.org/drawingml/2006/wordprocessingDrawing" xmlns:w10="urn:schemas-microsoft-com:office:word" xmlns:w="http://schemas.openxmlformats.org/wordprocessingml/2006/main" xmlns:w14="http://schemas.microsoft.com/office/word/2010/wordml" xmlns:w15="http://schemas.microsoft.com/office/word/2012/wordml" xmlns:w16cex="http://schemas.microsoft.com/office/word/2018/wordml/cex" xmlns:w16cid="http://schemas.microsoft.com/office/word/2016/wordml/cid" xmlns:w16="http://schemas.microsoft.com/office/word/2018/wordml" xmlns:w16du="http://schemas.microsoft.com/office/word/2023/wordml/word16du" xmlns:w16sdtdh="http://schemas.microsoft.com/office/word/2020/wordml/sdtdatahash" xmlns:w16sdtfl="http://schemas.microsoft.com/office/word/2024/wordml/sdtformatlock" xmlns:w16se="http://schemas.microsoft.com/office/word/2015/wordml/symex" xmlns:wpg="http://schemas.microsoft.com/office/word/2010/wordprocessingGroup" xmlns:wpi="http://schemas.microsoft.com/office/word/2010/wordprocessingInk" xmlns:wne="http://schemas.microsoft.com/office/word/2006/wordml" xmlns:wps="http://schemas.microsoft.com/office/word/2010/wordprocessingShape" mc:Ignorable="w14 w15 w16se w16cid w16 w16cex w16sdtdh w16sdtfl w16du wp14">
-  <w15:commentEx w15:paraId="4BD02AE6" w15:done="0"/>
-  <w15:commentEx w15:paraId="0780C4BF" w15:done="0"/>
-</w15:commentsEx>
-</file>
-
-<file path=word/commentsExtensible.xml><?xml version="1.0" encoding="utf-8"?>
-<w16cex:commentsExtensible xmlns:wpc="http://schemas.microsoft.com/office/word/2010/wordprocessingCanvas" xmlns:cx="http://schemas.microsoft.com/office/drawing/2014/chartex" xmlns:cx1="http://schemas.microsoft.com/office/drawing/2015/9/8/chartex" xmlns:cx2="http://schemas.microsoft.com/office/drawing/2015/10/21/chartex" xmlns:cx3="http://schemas.microsoft.com/office/drawing/2016/5/9/chartex" xmlns:cx4="http://schemas.microsoft.com/office/drawing/2016/5/10/chartex" xmlns:cx5="http://schemas.microsoft.com/office/drawing/2016/5/11/chartex" xmlns:cx6="http://schemas.microsoft.com/office/drawing/2016/5/12/chartex" xmlns:cx7="http://schemas.microsoft.com/office/drawing/2016/5/13/chartex" xmlns:cx8="http://schemas.microsoft.com/office/drawing/2016/5/14/chartex" xmlns:cr="http://schemas.microsoft.com/office/comments/2020/reactions" xmlns:mc="http://schemas.openxmlformats.org/markup-compatibility/2006" xmlns:aink="http://schemas.microsoft.com/office/drawing/2016/ink" xmlns:am3d="http://schemas.microsoft.com/office/drawing/2017/model3d" xmlns:o="urn:schemas-microsoft-com:office:office" xmlns:oel="http://schemas.microsoft.com/office/2019/extlst" xmlns:r="http://schemas.openxmlformats.org/officeDocument/2006/relationships" xmlns:m="http://schemas.openxmlformats.org/officeDocument/2006/math" xmlns:v="urn:schemas-microsoft-com:vml" xmlns:wp14="http://schemas.microsoft.com/office/word/2010/wordprocessingDrawing" xmlns:wp="http://schemas.openxmlformats.org/drawingml/2006/wordprocessingDrawing" xmlns:w10="urn:schemas-microsoft-com:office:word" xmlns:w="http://schemas.openxmlformats.org/wordprocessingml/2006/main" xmlns:w14="http://schemas.microsoft.com/office/word/2010/wordml" xmlns:w15="http://schemas.microsoft.com/office/word/2012/wordml" xmlns:w16cex="http://schemas.microsoft.com/office/word/2018/wordml/cex" xmlns:w16cid="http://schemas.microsoft.com/office/word/2016/wordml/cid" xmlns:w16="http://schemas.microsoft.com/office/word/2018/wordml" xmlns:w16du="http://schemas.microsoft.com/office/word/2023/wordml/word16du" xmlns:w16sdtdh="http://schemas.microsoft.com/office/word/2020/wordml/sdtdatahash" xmlns:w16sdtfl="http://schemas.microsoft.com/office/word/2024/wordml/sdtformatlock" xmlns:w16se="http://schemas.microsoft.com/office/word/2015/wordml/symex" xmlns:wpg="http://schemas.microsoft.com/office/word/2010/wordprocessingGroup" xmlns:wpi="http://schemas.microsoft.com/office/word/2010/wordprocessingInk" xmlns:wne="http://schemas.microsoft.com/office/word/2006/wordml" xmlns:wps="http://schemas.microsoft.com/office/word/2010/wordprocessingShape" mc:Ignorable="w14 w15 w16se w16cid w16 w16cex w16sdtdh w16sdtfl cr w16du wp14">
-  <w16cex:commentExtensible w16cex:durableId="5B11D124" w16cex:dateUtc="2025-01-05T19:53:00Z"/>
-  <w16cex:commentExtensible w16cex:durableId="7A622C2A" w16cex:dateUtc="2025-01-05T19:56:00Z"/>
-</w16cex:commentsExtensible>
-</file>
-
-<file path=word/commentsIds.xml><?xml version="1.0" encoding="utf-8"?>
-<w16cid:commentsIds xmlns:wpc="http://schemas.microsoft.com/office/word/2010/wordprocessingCanvas" xmlns:cx="http://schemas.microsoft.com/office/drawing/2014/chartex" xmlns:cx1="http://schemas.microsoft.com/office/drawing/2015/9/8/chartex" xmlns:cx2="http://schemas.microsoft.com/office/drawing/2015/10/21/chartex" xmlns:cx3="http://schemas.microsoft.com/office/drawing/2016/5/9/chartex" xmlns:cx4="http://schemas.microsoft.com/office/drawing/2016/5/10/chartex" xmlns:cx5="http://schemas.microsoft.com/office/drawing/2016/5/11/chartex" xmlns:cx6="http://schemas.microsoft.com/office/drawing/2016/5/12/chartex" xmlns:cx7="http://schemas.microsoft.com/office/drawing/2016/5/13/chartex" xmlns:cx8="http://schemas.microsoft.com/office/drawing/2016/5/14/chartex" xmlns:mc="http://schemas.openxmlformats.org/markup-compatibility/2006" xmlns:aink="http://schemas.microsoft.com/office/drawing/2016/ink" xmlns:am3d="http://schemas.microsoft.com/office/drawing/2017/model3d" xmlns:o="urn:schemas-microsoft-com:office:office" xmlns:oel="http://schemas.microsoft.com/office/2019/extlst" xmlns:r="http://schemas.openxmlformats.org/officeDocument/2006/relationships" xmlns:m="http://schemas.openxmlformats.org/officeDocument/2006/math" xmlns:v="urn:schemas-microsoft-com:vml" xmlns:wp14="http://schemas.microsoft.com/office/word/2010/wordprocessingDrawing" xmlns:wp="http://schemas.openxmlformats.org/drawingml/2006/wordprocessingDrawing" xmlns:w10="urn:schemas-microsoft-com:office:word" xmlns:w="http://schemas.openxmlformats.org/wordprocessingml/2006/main" xmlns:w14="http://schemas.microsoft.com/office/word/2010/wordml" xmlns:w15="http://schemas.microsoft.com/office/word/2012/wordml" xmlns:w16cex="http://schemas.microsoft.com/office/word/2018/wordml/cex" xmlns:w16cid="http://schemas.microsoft.com/office/word/2016/wordml/cid" xmlns:w16="http://schemas.microsoft.com/office/word/2018/wordml" xmlns:w16du="http://schemas.microsoft.com/office/word/2023/wordml/word16du" xmlns:w16sdtdh="http://schemas.microsoft.com/office/word/2020/wordml/sdtdatahash" xmlns:w16sdtfl="http://schemas.microsoft.com/office/word/2024/wordml/sdtformatlock" xmlns:w16se="http://schemas.microsoft.com/office/word/2015/wordml/symex" xmlns:wpg="http://schemas.microsoft.com/office/word/2010/wordprocessingGroup" xmlns:wpi="http://schemas.microsoft.com/office/word/2010/wordprocessingInk" xmlns:wne="http://schemas.microsoft.com/office/word/2006/wordml" xmlns:wps="http://schemas.microsoft.com/office/word/2010/wordprocessingShape" mc:Ignorable="w14 w15 w16se w16cid w16 w16cex w16sdtdh w16sdtfl w16du wp14">
-  <w16cid:commentId w16cid:paraId="4BD02AE6" w16cid:durableId="5B11D124"/>
-  <w16cid:commentId w16cid:paraId="0780C4BF" w16cid:durableId="7A622C2A"/>
-</w16cid:commentsIds>
-</file>
-
 <file path=word/numbering.xml><?xml version="1.0" encoding="utf-8"?>
-<w:numbering xmlns:wpc="http://schemas.microsoft.com/office/word/2010/wordprocessingCanvas" xmlns:cx="http://schemas.microsoft.com/office/drawing/2014/chartex" xmlns:cx1="http://schemas.microsoft.com/office/drawing/2015/9/8/chartex" xmlns:cx2="http://schemas.microsoft.com/office/drawing/2015/10/21/chartex" xmlns:cx3="http://schemas.microsoft.com/office/drawing/2016/5/9/chartex" xmlns:cx4="http://schemas.microsoft.com/office/drawing/2016/5/10/chartex" xmlns:cx5="http://schemas.microsoft.com/office/drawing/2016/5/11/chartex" xmlns:cx6="http://schemas.microsoft.com/office/drawing/2016/5/12/chartex" xmlns:cx7="http://schemas.microsoft.com/office/drawing/2016/5/13/chartex" xmlns:cx8="http://schemas.microsoft.com/office/drawing/2016/5/14/chartex" xmlns:mc="http://schemas.openxmlformats.org/markup-compatibility/2006" xmlns:aink="http://schemas.microsoft.com/office/drawing/2016/ink" xmlns:am3d="http://schemas.microsoft.com/office/drawing/2017/model3d" xmlns:o="urn:schemas-microsoft-com:office:office" xmlns:oel="http://schemas.microsoft.com/office/2019/extlst" xmlns:r="http://schemas.openxmlformats.org/officeDocument/2006/relationships" xmlns:m="http://schemas.openxmlformats.org/officeDocument/2006/math" xmlns:v="urn:schemas-microsoft-com:vml" xmlns:wp14="http://schemas.microsoft.com/office/word/2010/wordprocessingDrawing" xmlns:wp="http://schemas.openxmlformats.org/drawingml/2006/wordprocessingDrawing" xmlns:w10="urn:schemas-microsoft-com:office:word" xmlns:w="http://schemas.openxmlformats.org/wordprocessingml/2006/main" xmlns:w14="http://schemas.microsoft.com/office/word/2010/wordml" xmlns:w15="http://schemas.microsoft.com/office/word/2012/wordml" xmlns:w16cex="http://schemas.microsoft.com/office/word/2018/wordml/cex" xmlns:w16cid="http://schemas.microsoft.com/office/word/2016/wordml/cid" xmlns:w16="http://schemas.microsoft.com/office/word/2018/wordml" xmlns:w16du="http://schemas.microsoft.com/office/word/2023/wordml/word16du" xmlns:w16sdtdh="http://schemas.microsoft.com/office/word/2020/wordml/sdtdatahash" xmlns:w16sdtfl="http://schemas.microsoft.com/office/word/2024/wordml/sdtformatlock" xmlns:w16se="http://schemas.microsoft.com/office/word/2015/wordml/symex" xmlns:wpg="http://schemas.microsoft.com/office/word/2010/wordprocessingGroup" xmlns:wpi="http://schemas.microsoft.com/office/word/2010/wordprocessingInk" xmlns:wne="http://schemas.microsoft.com/office/word/2006/wordml" xmlns:wps="http://schemas.microsoft.com/office/word/2010/wordprocessingShape" mc:Ignorable="w14 w15 w16se w16cid w16 w16cex w16sdtdh w16sdtfl w16du wp14">
+<w:numbering xmlns:wpc="http://schemas.microsoft.com/office/word/2010/wordprocessingCanvas" xmlns:cx="http://schemas.microsoft.com/office/drawing/2014/chartex" xmlns:cx1="http://schemas.microsoft.com/office/drawing/2015/9/8/chartex" xmlns:cx2="http://schemas.microsoft.com/office/drawing/2015/10/21/chartex" xmlns:cx3="http://schemas.microsoft.com/office/drawing/2016/5/9/chartex" xmlns:cx4="http://schemas.microsoft.com/office/drawing/2016/5/10/chartex" xmlns:cx5="http://schemas.microsoft.com/office/drawing/2016/5/11/chartex" xmlns:cx6="http://schemas.microsoft.com/office/drawing/2016/5/12/chartex" xmlns:cx7="http://schemas.microsoft.com/office/drawing/2016/5/13/chartex" xmlns:cx8="http://schemas.microsoft.com/office/drawing/2016/5/14/chartex" xmlns:mc="http://schemas.openxmlformats.org/markup-compatibility/2006" xmlns:aink="http://schemas.microsoft.com/office/drawing/2016/ink" xmlns:am3d="http://schemas.microsoft.com/office/drawing/2017/model3d" xmlns:o="urn:schemas-microsoft-com:office:office" xmlns:oel="http://schemas.microsoft.com/office/2019/extlst" xmlns:r="http://schemas.openxmlformats.org/officeDocument/2006/relationships" xmlns:m="http://schemas.openxmlformats.org/officeDocument/2006/math" xmlns:v="urn:schemas-microsoft-com:vml" xmlns:wp14="http://schemas.microsoft.com/office/word/2010/wordprocessingDrawing" xmlns:wp="http://schemas.openxmlformats.org/drawingml/2006/wordprocessingDrawing" xmlns:w10="urn:schemas-microsoft-com:office:word" xmlns:w="http://schemas.openxmlformats.org/wordprocessingml/2006/main" xmlns:w14="http://schemas.microsoft.com/office/word/2010/wordml" xmlns:w15="http://schemas.microsoft.com/office/word/2012/wordml" xmlns:w16cex="http://schemas.microsoft.com/office/word/2018/wordml/cex" xmlns:w16cid="http://schemas.microsoft.com/office/word/2016/wordml/cid" xmlns:w16="http://schemas.microsoft.com/office/word/2018/wordml" xmlns:w16du="http://schemas.microsoft.com/office/word/2023/wordml/word16du" xmlns:w16sdtdh="http://schemas.microsoft.com/office/word/2020/wordml/sdtdatahash" xmlns:w16se="http://schemas.microsoft.com/office/word/2015/wordml/symex" xmlns:wpg="http://schemas.microsoft.com/office/word/2010/wordprocessingGroup" xmlns:wpi="http://schemas.microsoft.com/office/word/2010/wordprocessingInk" xmlns:wne="http://schemas.microsoft.com/office/word/2006/wordml" xmlns:wps="http://schemas.microsoft.com/office/word/2010/wordprocessingShape" mc:Ignorable="w14 w15 w16se w16cid w16 w16cex w16sdtdh w16du wp14">
   <w:abstractNum w:abstractNumId="0" w15:restartNumberingAfterBreak="0">
     <w:nsid w:val="220B2586"/>
     <w:multiLevelType w:val="hybridMultilevel"/>
@@ -1768,22 +1345,246 @@
       </w:rPr>
     </w:lvl>
   </w:abstractNum>
+  <w:abstractNum w:abstractNumId="1" w15:restartNumberingAfterBreak="0">
+    <w:nsid w:val="2CEB7AA4"/>
+    <w:multiLevelType w:val="hybridMultilevel"/>
+    <w:tmpl w:val="14EE3128"/>
+    <w:lvl w:ilvl="0" w:tplc="0C0A0001">
+      <w:start w:val="1"/>
+      <w:numFmt w:val="bullet"/>
+      <w:lvlText w:val=""/>
+      <w:lvlJc w:val="left"/>
+      <w:pPr>
+        <w:ind w:left="720" w:hanging="360"/>
+      </w:pPr>
+      <w:rPr>
+        <w:rFonts w:ascii="Symbol" w:hAnsi="Symbol" w:hint="default"/>
+      </w:rPr>
+    </w:lvl>
+    <w:lvl w:ilvl="1" w:tplc="0C0A0003" w:tentative="1">
+      <w:start w:val="1"/>
+      <w:numFmt w:val="bullet"/>
+      <w:lvlText w:val="o"/>
+      <w:lvlJc w:val="left"/>
+      <w:pPr>
+        <w:ind w:left="1440" w:hanging="360"/>
+      </w:pPr>
+      <w:rPr>
+        <w:rFonts w:ascii="Courier New" w:hAnsi="Courier New" w:cs="Courier New" w:hint="default"/>
+      </w:rPr>
+    </w:lvl>
+    <w:lvl w:ilvl="2" w:tplc="0C0A0005" w:tentative="1">
+      <w:start w:val="1"/>
+      <w:numFmt w:val="bullet"/>
+      <w:lvlText w:val=""/>
+      <w:lvlJc w:val="left"/>
+      <w:pPr>
+        <w:ind w:left="2160" w:hanging="360"/>
+      </w:pPr>
+      <w:rPr>
+        <w:rFonts w:ascii="Wingdings" w:hAnsi="Wingdings" w:hint="default"/>
+      </w:rPr>
+    </w:lvl>
+    <w:lvl w:ilvl="3" w:tplc="0C0A0001" w:tentative="1">
+      <w:start w:val="1"/>
+      <w:numFmt w:val="bullet"/>
+      <w:lvlText w:val=""/>
+      <w:lvlJc w:val="left"/>
+      <w:pPr>
+        <w:ind w:left="2880" w:hanging="360"/>
+      </w:pPr>
+      <w:rPr>
+        <w:rFonts w:ascii="Symbol" w:hAnsi="Symbol" w:hint="default"/>
+      </w:rPr>
+    </w:lvl>
+    <w:lvl w:ilvl="4" w:tplc="0C0A0003" w:tentative="1">
+      <w:start w:val="1"/>
+      <w:numFmt w:val="bullet"/>
+      <w:lvlText w:val="o"/>
+      <w:lvlJc w:val="left"/>
+      <w:pPr>
+        <w:ind w:left="3600" w:hanging="360"/>
+      </w:pPr>
+      <w:rPr>
+        <w:rFonts w:ascii="Courier New" w:hAnsi="Courier New" w:cs="Courier New" w:hint="default"/>
+      </w:rPr>
+    </w:lvl>
+    <w:lvl w:ilvl="5" w:tplc="0C0A0005" w:tentative="1">
+      <w:start w:val="1"/>
+      <w:numFmt w:val="bullet"/>
+      <w:lvlText w:val=""/>
+      <w:lvlJc w:val="left"/>
+      <w:pPr>
+        <w:ind w:left="4320" w:hanging="360"/>
+      </w:pPr>
+      <w:rPr>
+        <w:rFonts w:ascii="Wingdings" w:hAnsi="Wingdings" w:hint="default"/>
+      </w:rPr>
+    </w:lvl>
+    <w:lvl w:ilvl="6" w:tplc="0C0A0001" w:tentative="1">
+      <w:start w:val="1"/>
+      <w:numFmt w:val="bullet"/>
+      <w:lvlText w:val=""/>
+      <w:lvlJc w:val="left"/>
+      <w:pPr>
+        <w:ind w:left="5040" w:hanging="360"/>
+      </w:pPr>
+      <w:rPr>
+        <w:rFonts w:ascii="Symbol" w:hAnsi="Symbol" w:hint="default"/>
+      </w:rPr>
+    </w:lvl>
+    <w:lvl w:ilvl="7" w:tplc="0C0A0003" w:tentative="1">
+      <w:start w:val="1"/>
+      <w:numFmt w:val="bullet"/>
+      <w:lvlText w:val="o"/>
+      <w:lvlJc w:val="left"/>
+      <w:pPr>
+        <w:ind w:left="5760" w:hanging="360"/>
+      </w:pPr>
+      <w:rPr>
+        <w:rFonts w:ascii="Courier New" w:hAnsi="Courier New" w:cs="Courier New" w:hint="default"/>
+      </w:rPr>
+    </w:lvl>
+    <w:lvl w:ilvl="8" w:tplc="0C0A0005" w:tentative="1">
+      <w:start w:val="1"/>
+      <w:numFmt w:val="bullet"/>
+      <w:lvlText w:val=""/>
+      <w:lvlJc w:val="left"/>
+      <w:pPr>
+        <w:ind w:left="6480" w:hanging="360"/>
+      </w:pPr>
+      <w:rPr>
+        <w:rFonts w:ascii="Wingdings" w:hAnsi="Wingdings" w:hint="default"/>
+      </w:rPr>
+    </w:lvl>
+  </w:abstractNum>
+  <w:abstractNum w:abstractNumId="2" w15:restartNumberingAfterBreak="0">
+    <w:nsid w:val="2F742824"/>
+    <w:multiLevelType w:val="hybridMultilevel"/>
+    <w:tmpl w:val="3F18FD24"/>
+    <w:lvl w:ilvl="0" w:tplc="0C0A0001">
+      <w:start w:val="1"/>
+      <w:numFmt w:val="bullet"/>
+      <w:lvlText w:val=""/>
+      <w:lvlJc w:val="left"/>
+      <w:pPr>
+        <w:ind w:left="720" w:hanging="360"/>
+      </w:pPr>
+      <w:rPr>
+        <w:rFonts w:ascii="Symbol" w:hAnsi="Symbol" w:hint="default"/>
+      </w:rPr>
+    </w:lvl>
+    <w:lvl w:ilvl="1" w:tplc="0C0A0003" w:tentative="1">
+      <w:start w:val="1"/>
+      <w:numFmt w:val="bullet"/>
+      <w:lvlText w:val="o"/>
+      <w:lvlJc w:val="left"/>
+      <w:pPr>
+        <w:ind w:left="1440" w:hanging="360"/>
+      </w:pPr>
+      <w:rPr>
+        <w:rFonts w:ascii="Courier New" w:hAnsi="Courier New" w:cs="Courier New" w:hint="default"/>
+      </w:rPr>
+    </w:lvl>
+    <w:lvl w:ilvl="2" w:tplc="0C0A0005" w:tentative="1">
+      <w:start w:val="1"/>
+      <w:numFmt w:val="bullet"/>
+      <w:lvlText w:val=""/>
+      <w:lvlJc w:val="left"/>
+      <w:pPr>
+        <w:ind w:left="2160" w:hanging="360"/>
+      </w:pPr>
+      <w:rPr>
+        <w:rFonts w:ascii="Wingdings" w:hAnsi="Wingdings" w:hint="default"/>
+      </w:rPr>
+    </w:lvl>
+    <w:lvl w:ilvl="3" w:tplc="0C0A0001" w:tentative="1">
+      <w:start w:val="1"/>
+      <w:numFmt w:val="bullet"/>
+      <w:lvlText w:val=""/>
+      <w:lvlJc w:val="left"/>
+      <w:pPr>
+        <w:ind w:left="2880" w:hanging="360"/>
+      </w:pPr>
+      <w:rPr>
+        <w:rFonts w:ascii="Symbol" w:hAnsi="Symbol" w:hint="default"/>
+      </w:rPr>
+    </w:lvl>
+    <w:lvl w:ilvl="4" w:tplc="0C0A0003" w:tentative="1">
+      <w:start w:val="1"/>
+      <w:numFmt w:val="bullet"/>
+      <w:lvlText w:val="o"/>
+      <w:lvlJc w:val="left"/>
+      <w:pPr>
+        <w:ind w:left="3600" w:hanging="360"/>
+      </w:pPr>
+      <w:rPr>
+        <w:rFonts w:ascii="Courier New" w:hAnsi="Courier New" w:cs="Courier New" w:hint="default"/>
+      </w:rPr>
+    </w:lvl>
+    <w:lvl w:ilvl="5" w:tplc="0C0A0005" w:tentative="1">
+      <w:start w:val="1"/>
+      <w:numFmt w:val="bullet"/>
+      <w:lvlText w:val=""/>
+      <w:lvlJc w:val="left"/>
+      <w:pPr>
+        <w:ind w:left="4320" w:hanging="360"/>
+      </w:pPr>
+      <w:rPr>
+        <w:rFonts w:ascii="Wingdings" w:hAnsi="Wingdings" w:hint="default"/>
+      </w:rPr>
+    </w:lvl>
+    <w:lvl w:ilvl="6" w:tplc="0C0A0001" w:tentative="1">
+      <w:start w:val="1"/>
+      <w:numFmt w:val="bullet"/>
+      <w:lvlText w:val=""/>
+      <w:lvlJc w:val="left"/>
+      <w:pPr>
+        <w:ind w:left="5040" w:hanging="360"/>
+      </w:pPr>
+      <w:rPr>
+        <w:rFonts w:ascii="Symbol" w:hAnsi="Symbol" w:hint="default"/>
+      </w:rPr>
+    </w:lvl>
+    <w:lvl w:ilvl="7" w:tplc="0C0A0003" w:tentative="1">
+      <w:start w:val="1"/>
+      <w:numFmt w:val="bullet"/>
+      <w:lvlText w:val="o"/>
+      <w:lvlJc w:val="left"/>
+      <w:pPr>
+        <w:ind w:left="5760" w:hanging="360"/>
+      </w:pPr>
+      <w:rPr>
+        <w:rFonts w:ascii="Courier New" w:hAnsi="Courier New" w:cs="Courier New" w:hint="default"/>
+      </w:rPr>
+    </w:lvl>
+    <w:lvl w:ilvl="8" w:tplc="0C0A0005" w:tentative="1">
+      <w:start w:val="1"/>
+      <w:numFmt w:val="bullet"/>
+      <w:lvlText w:val=""/>
+      <w:lvlJc w:val="left"/>
+      <w:pPr>
+        <w:ind w:left="6480" w:hanging="360"/>
+      </w:pPr>
+      <w:rPr>
+        <w:rFonts w:ascii="Wingdings" w:hAnsi="Wingdings" w:hint="default"/>
+      </w:rPr>
+    </w:lvl>
+  </w:abstractNum>
   <w:num w:numId="1" w16cid:durableId="1455363969">
     <w:abstractNumId w:val="0"/>
+  </w:num>
+  <w:num w:numId="2" w16cid:durableId="1773895145">
+    <w:abstractNumId w:val="2"/>
+  </w:num>
+  <w:num w:numId="3" w16cid:durableId="1344359706">
+    <w:abstractNumId w:val="1"/>
   </w:num>
 </w:numbering>
 </file>
 
-<file path=word/people.xml><?xml version="1.0" encoding="utf-8"?>
-<w15:people xmlns:wpc="http://schemas.microsoft.com/office/word/2010/wordprocessingCanvas" xmlns:cx="http://schemas.microsoft.com/office/drawing/2014/chartex" xmlns:cx1="http://schemas.microsoft.com/office/drawing/2015/9/8/chartex" xmlns:cx2="http://schemas.microsoft.com/office/drawing/2015/10/21/chartex" xmlns:cx3="http://schemas.microsoft.com/office/drawing/2016/5/9/chartex" xmlns:cx4="http://schemas.microsoft.com/office/drawing/2016/5/10/chartex" xmlns:cx5="http://schemas.microsoft.com/office/drawing/2016/5/11/chartex" xmlns:cx6="http://schemas.microsoft.com/office/drawing/2016/5/12/chartex" xmlns:cx7="http://schemas.microsoft.com/office/drawing/2016/5/13/chartex" xmlns:cx8="http://schemas.microsoft.com/office/drawing/2016/5/14/chartex" xmlns:mc="http://schemas.openxmlformats.org/markup-compatibility/2006" xmlns:aink="http://schemas.microsoft.com/office/drawing/2016/ink" xmlns:am3d="http://schemas.microsoft.com/office/drawing/2017/model3d" xmlns:o="urn:schemas-microsoft-com:office:office" xmlns:oel="http://schemas.microsoft.com/office/2019/extlst" xmlns:r="http://schemas.openxmlformats.org/officeDocument/2006/relationships" xmlns:m="http://schemas.openxmlformats.org/officeDocument/2006/math" xmlns:v="urn:schemas-microsoft-com:vml" xmlns:wp14="http://schemas.microsoft.com/office/word/2010/wordprocessingDrawing" xmlns:wp="http://schemas.openxmlformats.org/drawingml/2006/wordprocessingDrawing" xmlns:w10="urn:schemas-microsoft-com:office:word" xmlns:w="http://schemas.openxmlformats.org/wordprocessingml/2006/main" xmlns:w14="http://schemas.microsoft.com/office/word/2010/wordml" xmlns:w15="http://schemas.microsoft.com/office/word/2012/wordml" xmlns:w16cex="http://schemas.microsoft.com/office/word/2018/wordml/cex" xmlns:w16cid="http://schemas.microsoft.com/office/word/2016/wordml/cid" xmlns:w16="http://schemas.microsoft.com/office/word/2018/wordml" xmlns:w16du="http://schemas.microsoft.com/office/word/2023/wordml/word16du" xmlns:w16sdtdh="http://schemas.microsoft.com/office/word/2020/wordml/sdtdatahash" xmlns:w16sdtfl="http://schemas.microsoft.com/office/word/2024/wordml/sdtformatlock" xmlns:w16se="http://schemas.microsoft.com/office/word/2015/wordml/symex" xmlns:wpg="http://schemas.microsoft.com/office/word/2010/wordprocessingGroup" xmlns:wpi="http://schemas.microsoft.com/office/word/2010/wordprocessingInk" xmlns:wne="http://schemas.microsoft.com/office/word/2006/wordml" xmlns:wps="http://schemas.microsoft.com/office/word/2010/wordprocessingShape" mc:Ignorable="w14 w15 w16se w16cid w16 w16cex w16sdtdh w16sdtfl w16du wp14">
-  <w15:person w15:author="Sandra Mingo Ramírez">
-    <w15:presenceInfo w15:providerId="AD" w15:userId="S::sandra.mingo@estudiante.uam.es::57fa5533-e9c4-42f5-99f3-97d4dcb50e63"/>
-  </w15:person>
-</w15:people>
-</file>
-
 <file path=word/styles.xml><?xml version="1.0" encoding="utf-8"?>
-<w:styles xmlns:mc="http://schemas.openxmlformats.org/markup-compatibility/2006" xmlns:r="http://schemas.openxmlformats.org/officeDocument/2006/relationships" xmlns:w="http://schemas.openxmlformats.org/wordprocessingml/2006/main" xmlns:w14="http://schemas.microsoft.com/office/word/2010/wordml" xmlns:w15="http://schemas.microsoft.com/office/word/2012/wordml" xmlns:w16cex="http://schemas.microsoft.com/office/word/2018/wordml/cex" xmlns:w16cid="http://schemas.microsoft.com/office/word/2016/wordml/cid" xmlns:w16="http://schemas.microsoft.com/office/word/2018/wordml" xmlns:w16du="http://schemas.microsoft.com/office/word/2023/wordml/word16du" xmlns:w16sdtdh="http://schemas.microsoft.com/office/word/2020/wordml/sdtdatahash" xmlns:w16sdtfl="http://schemas.microsoft.com/office/word/2024/wordml/sdtformatlock" xmlns:w16se="http://schemas.microsoft.com/office/word/2015/wordml/symex" mc:Ignorable="w14 w15 w16se w16cid w16 w16cex w16sdtdh w16sdtfl w16du">
+<w:styles xmlns:mc="http://schemas.openxmlformats.org/markup-compatibility/2006" xmlns:r="http://schemas.openxmlformats.org/officeDocument/2006/relationships" xmlns:w="http://schemas.openxmlformats.org/wordprocessingml/2006/main" xmlns:w14="http://schemas.microsoft.com/office/word/2010/wordml" xmlns:w15="http://schemas.microsoft.com/office/word/2012/wordml" xmlns:w16cex="http://schemas.microsoft.com/office/word/2018/wordml/cex" xmlns:w16cid="http://schemas.microsoft.com/office/word/2016/wordml/cid" xmlns:w16="http://schemas.microsoft.com/office/word/2018/wordml" xmlns:w16du="http://schemas.microsoft.com/office/word/2023/wordml/word16du" xmlns:w16sdtdh="http://schemas.microsoft.com/office/word/2020/wordml/sdtdatahash" xmlns:w16se="http://schemas.microsoft.com/office/word/2015/wordml/symex" mc:Ignorable="w14 w15 w16se w16cid w16 w16cex w16sdtdh w16du">
   <w:docDefaults>
     <w:rPrDefault>
       <w:rPr>

</xml_diff>